<commit_message>
feat: FHNW CI/CD Redesign mit responsivem Layout und Dokumentation Session 17
- FHNW Corporate Identity: Gelb #FDE70E, Logo, graue Accordions mit +/× Icon
- Weisser Seitenhintergrund, Accordions starten geschlossen
- Responsives Layout mit Hamburger-Menü und Sidebar-Overlay für Mobile
- Icons: FHNW_Logo.webp, IconPDF.png, IconBuch.png integriert
- Session 17 Lernjournal mit Screenshots in Doku nachgeführt

Co-Authored-By: Claude Sonnet 4.6 <noreply@anthropic.com>
</commit_message>
<xml_diff>
--- a/doku/IT-Lehre Handlungskompetenen Doku.docx
+++ b/doku/IT-Lehre Handlungskompetenen Doku.docx
@@ -592,6 +592,7 @@
         <w:pStyle w:val="berschrift2"/>
       </w:pPr>
       <w:r>
+        <w:lastRenderedPageBreak/>
         <w:t>Lernjournal – Session 16 (16. April 2026)</w:t>
       </w:r>
     </w:p>
@@ -652,11 +653,254 @@
     <w:p>
       <w:r>
         <w:t>• PDF-Kartenhöhe: BOX_H = 40 + max(48mm, Anzahl_Bereiche × 5.8mm) – wächst automatisch mit der Anzahl sichtbarer Bereiche.</w:t>
+      </w:r>
+    </w:p>
+    <w:p>
+      <w:pPr>
+        <w:spacing w:after="200" w:line="276" w:lineRule="auto"/>
+      </w:pPr>
+      <w:r>
+        <w:br w:type="page"/>
+      </w:r>
+    </w:p>
+    <w:p>
+      <w:pPr>
+        <w:pStyle w:val="berschrift1"/>
+      </w:pPr>
+      <w:r>
+        <w:t>Session 17 – 17. April 2026: FHNW Corporate-Identity-Redesign</w:t>
+      </w:r>
+    </w:p>
+    <w:p>
+      <w:r>
+        <w:t>In dieser Session wurde die Benutzeroberfläche des Handlungskompetenz-Trackers vollständig an das Corporate Identity der FHNW Nordwestschweiz angepasst. Ziel war eine professionelle, konsistente Gestaltung im FHNW-Design mit gelber Primärfarbe, Logo-Integration und einem responsiven Layout für Desktop und Mobile.</w:t>
+      </w:r>
+    </w:p>
+    <w:p/>
+    <w:p>
+      <w:pPr>
+        <w:pStyle w:val="berschrift2"/>
+      </w:pPr>
+      <w:r>
+        <w:t>Umgesetzte Design-Anpassungen</w:t>
+      </w:r>
+    </w:p>
+    <w:p>
+      <w:r>
+        <w:t>• FHNW-Gelb (#FDE70E) als Primärfarbe für Header und Sidebar</w:t>
+      </w:r>
+    </w:p>
+    <w:p>
+      <w:r>
+        <w:t>• FHNW Logo (FHNW_Logo.webp) links im Header-Bereich integriert</w:t>
+      </w:r>
+    </w:p>
+    <w:p>
+      <w:r>
+        <w:t>• Grauer Accordion-Block (#efefef) mit «+»/«×»-Icon für auf-/zugeklappte Kompetenz-Bereiche</w:t>
+      </w:r>
+    </w:p>
+    <w:p>
+      <w:r>
+        <w:t>• Geöffnete Accordions in hellem FHNW-Gelb (#FFF48D) hervorgehoben</w:t>
+      </w:r>
+    </w:p>
+    <w:p>
+      <w:r>
+        <w:t>• Weisser Seitenhintergrund (#ffffff) statt grauem Hintergrund</w:t>
+      </w:r>
+    </w:p>
+    <w:p>
+      <w:r>
+        <w:t>• PDF-Export-Button mit eigenem FHNW-Icon (IconPDF.png)</w:t>
+      </w:r>
+    </w:p>
+    <w:p>
+      <w:r>
+        <w:t>• Buchsymbol (IconBuch.png) als Icon für den Übersicht-Navigationseintrag</w:t>
+      </w:r>
+    </w:p>
+    <w:p>
+      <w:r>
+        <w:t>• Alle Accordions starten geschlossen – Nutzer sieht zuerst die Gesamtübersicht</w:t>
+      </w:r>
+    </w:p>
+    <w:p>
+      <w:r>
+        <w:t>• Responsives Layout: Hamburger-Menü auf mobilen Geräten, Sidebar als Overlay</w:t>
+      </w:r>
+    </w:p>
+    <w:p/>
+    <w:p>
+      <w:pPr>
+        <w:pStyle w:val="berschrift2"/>
+      </w:pPr>
+      <w:r>
+        <w:t>Screenshot: Übersichtsansicht (Desktop)</w:t>
+      </w:r>
+    </w:p>
+    <w:p>
+      <w:r>
+        <w:t>Die Übersichtsseite zeigt den Lehrzeit-Fortschritt, die Bereichskarten und das Gesamt-Tortendiagramm im FHNW-Design mit gelbem Header und gelber Sidebar.</w:t>
+      </w:r>
+    </w:p>
+    <w:p>
+      <w:r>
+        <w:rPr>
+          <w:noProof/>
+        </w:rPr>
+        <w:drawing>
+          <wp:inline distT="0" distB="0" distL="0" distR="0" wp14:anchorId="51C4CFFB" wp14:editId="3A9AFB20">
+            <wp:extent cx="5040000" cy="3009997"/>
+            <wp:effectExtent l="0" t="0" r="8255" b="0"/>
+            <wp:docPr id="1269599319" name="Grafik 1"/>
+            <wp:cNvGraphicFramePr/>
+            <a:graphic xmlns:a="http://schemas.openxmlformats.org/drawingml/2006/main">
+              <a:graphicData uri="http://schemas.openxmlformats.org/drawingml/2006/picture">
+                <pic:pic xmlns:pic="http://schemas.openxmlformats.org/drawingml/2006/picture">
+                  <pic:nvPicPr>
+                    <pic:cNvPr id="1269599319" name=""/>
+                    <pic:cNvPicPr/>
+                  </pic:nvPicPr>
+                  <pic:blipFill>
+                    <a:blip r:embed="rId12" cstate="print">
+                      <a:extLst>
+                        <a:ext uri="{28A0092B-C50C-407E-A947-70E740481C1C}">
+                          <a14:useLocalDpi xmlns:a14="http://schemas.microsoft.com/office/drawing/2010/main" val="0"/>
+                        </a:ext>
+                      </a:extLst>
+                    </a:blip>
+                    <a:stretch>
+                      <a:fillRect/>
+                    </a:stretch>
+                  </pic:blipFill>
+                  <pic:spPr>
+                    <a:xfrm>
+                      <a:off x="0" y="0"/>
+                      <a:ext cx="5040000" cy="3009997"/>
+                    </a:xfrm>
+                    <a:prstGeom prst="rect">
+                      <a:avLst/>
+                    </a:prstGeom>
+                  </pic:spPr>
+                </pic:pic>
+              </a:graphicData>
+            </a:graphic>
+          </wp:inline>
+        </w:drawing>
+      </w:r>
+    </w:p>
+    <w:p/>
+    <w:p>
+      <w:pPr>
+        <w:pStyle w:val="berschrift2"/>
+      </w:pPr>
+      <w:r>
+        <w:t>Screenshot: Bereichsansicht mit Accordion</w:t>
+      </w:r>
+    </w:p>
+    <w:p>
+      <w:r>
+        <w:t>Die Bereichsansicht zeigt die Handlungskompetenzen als aufklappbare Accordion-Blöcke. Geöffnete Bereiche erscheinen in hellem Gelb (#FFF48D) mit einem «×»-Icon, geschlossene Bereiche in Grau (#efefef) mit «+»-Icon. Jedes Leistungsziel enthält die Bloom-Bewertungsknöpfe (K0–K5) und ein Kommentarfeld.</w:t>
+      </w:r>
+    </w:p>
+    <w:p>
+      <w:r>
+        <w:rPr>
+          <w:noProof/>
+        </w:rPr>
+        <w:drawing>
+          <wp:inline distT="0" distB="0" distL="0" distR="0" wp14:anchorId="67B54F66" wp14:editId="128CB225">
+            <wp:extent cx="5040000" cy="3009997"/>
+            <wp:effectExtent l="0" t="0" r="8255" b="0"/>
+            <wp:docPr id="1915599821" name="Grafik 2"/>
+            <wp:cNvGraphicFramePr/>
+            <a:graphic xmlns:a="http://schemas.openxmlformats.org/drawingml/2006/main">
+              <a:graphicData uri="http://schemas.openxmlformats.org/drawingml/2006/picture">
+                <pic:pic xmlns:pic="http://schemas.openxmlformats.org/drawingml/2006/picture">
+                  <pic:nvPicPr>
+                    <pic:cNvPr id="1915599821" name=""/>
+                    <pic:cNvPicPr/>
+                  </pic:nvPicPr>
+                  <pic:blipFill>
+                    <a:blip r:embed="rId13" cstate="print">
+                      <a:extLst>
+                        <a:ext uri="{28A0092B-C50C-407E-A947-70E740481C1C}">
+                          <a14:useLocalDpi xmlns:a14="http://schemas.microsoft.com/office/drawing/2010/main" val="0"/>
+                        </a:ext>
+                      </a:extLst>
+                    </a:blip>
+                    <a:stretch>
+                      <a:fillRect/>
+                    </a:stretch>
+                  </pic:blipFill>
+                  <pic:spPr>
+                    <a:xfrm>
+                      <a:off x="0" y="0"/>
+                      <a:ext cx="5040000" cy="3009997"/>
+                    </a:xfrm>
+                    <a:prstGeom prst="rect">
+                      <a:avLst/>
+                    </a:prstGeom>
+                  </pic:spPr>
+                </pic:pic>
+              </a:graphicData>
+            </a:graphic>
+          </wp:inline>
+        </w:drawing>
+      </w:r>
+    </w:p>
+    <w:p/>
+    <w:p>
+      <w:pPr>
+        <w:pStyle w:val="berschrift2"/>
+      </w:pPr>
+      <w:r>
+        <w:t>Technische Umsetzung</w:t>
+      </w:r>
+    </w:p>
+    <w:p>
+      <w:r>
+        <w:t>• CSS Custom Properties (CSS-Variablen) für konsistente FHNW-Farbgebung im gesamten Stylesheet</w:t>
+      </w:r>
+    </w:p>
+    <w:p>
+      <w:r>
+        <w:t>• Accordion-Icon (+/×) via CSS ::before Pseudo-Element – kein zusätzliches JavaScript nötig</w:t>
+      </w:r>
+    </w:p>
+    <w:p>
+      <w:r>
+        <w:t>• Responsives Sidebar-Layout mit CSS transform: translateX() und JavaScript-Toggle-Funktion</w:t>
+      </w:r>
+    </w:p>
+    <w:p>
+      <w:r>
+        <w:t>• Hamburger-Menü auf Mobilgeräten öffnet die Sidebar als Overlay mit halbtransparentem Hintergrund</w:t>
+      </w:r>
+    </w:p>
+    <w:p>
+      <w:r>
+        <w:t>• FHNW-Logo und Icons als separate Bilddateien (FHNW_Logo.webp, IconPDF.png, IconBuch.png)</w:t>
+      </w:r>
+    </w:p>
+    <w:p/>
+    <w:p>
+      <w:pPr>
+        <w:pStyle w:val="berschrift2"/>
+      </w:pPr>
+      <w:r>
+        <w:t>Reflexion</w:t>
+      </w:r>
+    </w:p>
+    <w:p>
+      <w:r>
+        <w:t>Das FHNW-Redesign zeigt, wie professionelles Corporate Identity durch gezielte CSS-Anpassungen und saubere Komponentenstruktur umgesetzt werden kann. Besonders wertvoll war die Erkenntnis, dass CSS Custom Properties (Variablen) die spätere Anpassung und Wartung des Designs erheblich vereinfachen. Die automatisierte Screenshot-Erstellung mit dem Headless-Browser-Modus von Microsoft Edge erwies sich als zuverlässige Methode zur Dokumentation von UI-Zuständen.</w:t>
       </w:r>
     </w:p>
     <w:p/>
     <w:sectPr>
-      <w:headerReference w:type="first" r:id="rId12"/>
+      <w:headerReference w:type="first" r:id="rId14"/>
       <w:pgSz w:w="11906" w:h="16838" w:code="9"/>
       <w:pgMar w:top="1417" w:right="1417" w:bottom="1417" w:left="1417" w:header="709" w:footer="454" w:gutter="0"/>
       <w:cols w:space="708"/>
@@ -4528,21 +4772,6 @@
 </file>
 
 <file path=customXml/item2.xml><?xml version="1.0" encoding="utf-8"?>
-<p:properties xmlns:p="http://schemas.microsoft.com/office/2006/metadata/properties" xmlns:xsi="http://www.w3.org/2001/XMLSchema-instance" xmlns:pc="http://schemas.microsoft.com/office/infopath/2007/PartnerControls">
-  <documentManagement/>
-</p:properties>
-</file>
-
-<file path=customXml/item3.xml><?xml version="1.0" encoding="utf-8"?>
-<?mso-contentType ?>
-<FormTemplates xmlns="http://schemas.microsoft.com/sharepoint/v3/contenttype/forms">
-  <Display>DocumentLibraryForm</Display>
-  <Edit>DocumentLibraryForm</Edit>
-  <New>DocumentLibraryForm</New>
-</FormTemplates>
-</file>
-
-<file path=customXml/item4.xml><?xml version="1.0" encoding="utf-8"?>
 <ct:contentTypeSchema xmlns:ct="http://schemas.microsoft.com/office/2006/metadata/contentType" xmlns:ma="http://schemas.microsoft.com/office/2006/metadata/properties/metaAttributes" ct:_="" ma:_="" ma:contentTypeName="Dokument" ma:contentTypeID="0x0101007903E6EB9CF02E4A9D445768F33CE8A0" ma:contentTypeVersion="10" ma:contentTypeDescription="Ein neues Dokument erstellen." ma:contentTypeScope="" ma:versionID="6ae922be011154ab15be9f8e392bd017">
   <xsd:schema xmlns:xsd="http://www.w3.org/2001/XMLSchema" xmlns:xs="http://www.w3.org/2001/XMLSchema" xmlns:p="http://schemas.microsoft.com/office/2006/metadata/properties" xmlns:ns2="9c9658b7-70b6-4a85-98d8-6fbbaa45c305" xmlns:ns3="469fef08-e3b5-4743-af2d-0bc6e31c71c1" targetNamespace="http://schemas.microsoft.com/office/2006/metadata/properties" ma:root="true" ma:fieldsID="d06d8b5c4036d08665a49476e2e0a1f7" ns2:_="" ns3:_="">
     <xsd:import namespace="9c9658b7-70b6-4a85-98d8-6fbbaa45c305"/>
@@ -4747,6 +4976,21 @@
 </ct:contentTypeSchema>
 </file>
 
+<file path=customXml/item3.xml><?xml version="1.0" encoding="utf-8"?>
+<?mso-contentType ?>
+<FormTemplates xmlns="http://schemas.microsoft.com/sharepoint/v3/contenttype/forms">
+  <Display>DocumentLibraryForm</Display>
+  <Edit>DocumentLibraryForm</Edit>
+  <New>DocumentLibraryForm</New>
+</FormTemplates>
+</file>
+
+<file path=customXml/item4.xml><?xml version="1.0" encoding="utf-8"?>
+<p:properties xmlns:p="http://schemas.microsoft.com/office/2006/metadata/properties" xmlns:xsi="http://www.w3.org/2001/XMLSchema-instance" xmlns:pc="http://schemas.microsoft.com/office/infopath/2007/PartnerControls">
+  <documentManagement/>
+</p:properties>
+</file>
+
 <file path=customXml/item5.xml><?xml version="1.0" encoding="utf-8"?>
 <b:Sources xmlns:b="http://schemas.openxmlformats.org/officeDocument/2006/bibliography" xmlns="http://schemas.openxmlformats.org/officeDocument/2006/bibliography" SelectedStyle="\APA.XSL" StyleName="APA"/>
 </file>
@@ -4760,23 +5004,6 @@
 </file>
 
 <file path=customXml/itemProps2.xml><?xml version="1.0" encoding="utf-8"?>
-<ds:datastoreItem xmlns:ds="http://schemas.openxmlformats.org/officeDocument/2006/customXml" ds:itemID="{49D8654D-D35F-45A1-916C-E770D409409A}">
-  <ds:schemaRefs>
-    <ds:schemaRef ds:uri="http://schemas.microsoft.com/office/2006/metadata/properties"/>
-    <ds:schemaRef ds:uri="http://schemas.microsoft.com/office/infopath/2007/PartnerControls"/>
-  </ds:schemaRefs>
-</ds:datastoreItem>
-</file>
-
-<file path=customXml/itemProps3.xml><?xml version="1.0" encoding="utf-8"?>
-<ds:datastoreItem xmlns:ds="http://schemas.openxmlformats.org/officeDocument/2006/customXml" ds:itemID="{D2CF7831-0288-43C5-9AFD-4D67A1E58A9C}">
-  <ds:schemaRefs>
-    <ds:schemaRef ds:uri="http://schemas.microsoft.com/sharepoint/v3/contenttype/forms"/>
-  </ds:schemaRefs>
-</ds:datastoreItem>
-</file>
-
-<file path=customXml/itemProps4.xml><?xml version="1.0" encoding="utf-8"?>
 <ds:datastoreItem xmlns:ds="http://schemas.openxmlformats.org/officeDocument/2006/customXml" ds:itemID="{6FA82E95-11C5-463A-AADD-8A833425D8D2}">
   <ds:schemaRefs>
     <ds:schemaRef ds:uri="http://schemas.microsoft.com/office/2006/metadata/contentType"/>
@@ -4795,6 +5022,23 @@
 </ds:datastoreItem>
 </file>
 
+<file path=customXml/itemProps3.xml><?xml version="1.0" encoding="utf-8"?>
+<ds:datastoreItem xmlns:ds="http://schemas.openxmlformats.org/officeDocument/2006/customXml" ds:itemID="{D2CF7831-0288-43C5-9AFD-4D67A1E58A9C}">
+  <ds:schemaRefs>
+    <ds:schemaRef ds:uri="http://schemas.microsoft.com/sharepoint/v3/contenttype/forms"/>
+  </ds:schemaRefs>
+</ds:datastoreItem>
+</file>
+
+<file path=customXml/itemProps4.xml><?xml version="1.0" encoding="utf-8"?>
+<ds:datastoreItem xmlns:ds="http://schemas.openxmlformats.org/officeDocument/2006/customXml" ds:itemID="{49D8654D-D35F-45A1-916C-E770D409409A}">
+  <ds:schemaRefs>
+    <ds:schemaRef ds:uri="http://schemas.microsoft.com/office/2006/metadata/properties"/>
+    <ds:schemaRef ds:uri="http://schemas.microsoft.com/office/infopath/2007/PartnerControls"/>
+  </ds:schemaRefs>
+</ds:datastoreItem>
+</file>
+
 <file path=customXml/itemProps5.xml><?xml version="1.0" encoding="utf-8"?>
 <ds:datastoreItem xmlns:ds="http://schemas.openxmlformats.org/officeDocument/2006/customXml" ds:itemID="{59CD317E-5156-4C3B-90E9-8DED7CA2EC5E}">
   <ds:schemaRefs>

</xml_diff>

<commit_message>
docs: Startbefehle für Backend und Frontend in Doku ergänzt
Co-Authored-By: Claude Sonnet 4.6 <noreply@anthropic.com>
</commit_message>
<xml_diff>
--- a/doku/IT-Lehre Handlungskompetenen Doku.docx
+++ b/doku/IT-Lehre Handlungskompetenen Doku.docx
@@ -7,7 +7,13 @@
         <w:pStyle w:val="berschrift1"/>
       </w:pPr>
       <w:r>
-        <w:t>Projektuebersicht</w:t>
+        <w:t>Projekt</w:t>
+      </w:r>
+      <w:r>
+        <w:t>ü</w:t>
+      </w:r>
+      <w:r>
+        <w:t>bersicht</w:t>
       </w:r>
     </w:p>
     <w:p>
@@ -20,7 +26,19 @@
     </w:p>
     <w:p>
       <w:r>
-        <w:t>Dieses Dokument begleitet die Lernreise von Iwo Kuhn im Rahmen der Vorbereitung auf den CAS Kuenstliche Intelligenz fuer Softwareentwicklung (AI-SE) an der FHNW. Es dokumentiert alle umgesetzten Projekte, technischen Entscheide und Lernfortschritte.</w:t>
+        <w:t>Dieses Dokument begleitet die Lernreise von Iwo Kuhn im Rahmen der Vorbereitung auf den CAS K</w:t>
+      </w:r>
+      <w:r>
+        <w:t>ü</w:t>
+      </w:r>
+      <w:r>
+        <w:t>nstliche Intelligenz f</w:t>
+      </w:r>
+      <w:r>
+        <w:t>ü</w:t>
+      </w:r>
+      <w:r>
+        <w:t>r Softwareentwicklung (AI-SE) an der FHNW. Es dokumentiert alle umgesetzten Projekte, technischen Entscheide und Lernfortschritte.</w:t>
       </w:r>
     </w:p>
     <w:p>
@@ -48,7 +66,13 @@
     </w:p>
     <w:p>
       <w:r>
-        <w:t>4. Weitere KI-gestuetzte Werkzeuge im Rahmen des CAS AI-SE (geplant)</w:t>
+        <w:t>4. Weitere KI-gest</w:t>
+      </w:r>
+      <w:r>
+        <w:t>ü</w:t>
+      </w:r>
+      <w:r>
+        <w:t>tzte Werkzeuge im Rahmen des CAS AI-SE (geplant)</w:t>
       </w:r>
     </w:p>
     <w:p>
@@ -61,7 +85,13 @@
     </w:p>
     <w:p>
       <w:r>
-        <w:t>Frontend:   HTML / CSS / JavaScript - spaeter React oder Vue</w:t>
+        <w:t>Frontend:   HTML / CSS / JavaScript - sp</w:t>
+      </w:r>
+      <w:r>
+        <w:t>a</w:t>
+      </w:r>
+      <w:r>
+        <w:t>ter React oder Vue</w:t>
       </w:r>
     </w:p>
     <w:p>
@@ -80,8 +110,28 @@
       </w:r>
     </w:p>
     <w:p>
-      <w:r>
-        <w:t>Spaeter:    Azure DevOps REST API, KI-Komponenten (CAS AI-SE)</w:t>
+      <w:pPr>
+        <w:rPr>
+          <w:lang w:val="fr-CH"/>
+        </w:rPr>
+      </w:pPr>
+      <w:r>
+        <w:rPr>
+          <w:lang w:val="fr-CH"/>
+        </w:rPr>
+        <w:t>Sp</w:t>
+      </w:r>
+      <w:r>
+        <w:rPr>
+          <w:lang w:val="fr-CH"/>
+        </w:rPr>
+        <w:t>a</w:t>
+      </w:r>
+      <w:r>
+        <w:rPr>
+          <w:lang w:val="fr-CH"/>
+        </w:rPr>
+        <w:t>ter:    Azure DevOps REST API, KI-Komponenten (CAS AI-SE)</w:t>
       </w:r>
     </w:p>
     <w:p>
@@ -102,7 +152,13 @@
     </w:p>
     <w:p>
       <w:r>
-        <w:t>Web-Applikation zur Erfassung und Verfolgung von Handlungskompetenzen fuer Informatiklernende EFZ (Bildungsplan 88611). Bewertung von Leistungszielen nach Bloom-Taxonomie (K0-K6), Fortschrittsanzeige und PDF-Export.</w:t>
+        <w:t>Web-Applikation zur Erfassung und Verfolgung von Handlungskompetenzen f</w:t>
+      </w:r>
+      <w:r>
+        <w:t>ü</w:t>
+      </w:r>
+      <w:r>
+        <w:t>r Informatiklernende EFZ (Bildungsplan 88611). Bewertung von Leistungszielen nach Bloom-Taxonomie (K0-K6), Fortschrittsanzeige und PDF-Export.</w:t>
       </w:r>
     </w:p>
     <w:p>
@@ -123,7 +179,19 @@
     </w:p>
     <w:p>
       <w:r>
-        <w:t>Einzelne Datei kompetenz-tracker.html ohne externen Server. Datenspeicherung in kompetenzen.json auf einem gemeinsamen Netzlaufwerk via File System Access API des Browsers. Fallback auf localStorage fuer andere Browser. PDF-Export via jsPDF 2.5.1 und autotable 3.8.2 (CDN, benoetigt Internet).</w:t>
+        <w:t>Einzelne Datei kompetenz-tracker.html ohne externen Server. Datenspeicherung in kompetenzen.json auf einem gemeinsamen Netzlaufwerk via File System Access API des Browsers. Fallback auf localStorage f</w:t>
+      </w:r>
+      <w:r>
+        <w:t>ü</w:t>
+      </w:r>
+      <w:r>
+        <w:t>r andere Browser. PDF-Export via jsPDF 2.5.1 und autotable 3.8.2 (CDN, ben</w:t>
+      </w:r>
+      <w:r>
+        <w:t>ö</w:t>
+      </w:r>
+      <w:r>
+        <w:t>tigt Internet).</w:t>
       </w:r>
     </w:p>
     <w:p>
@@ -136,7 +204,13 @@
     </w:p>
     <w:p>
       <w:r>
-        <w:t>- Personenverwaltung: Erfassen, Bearbeiten, Loeschen (Name, Fachrichtung, Lehrbeginn)</w:t>
+        <w:t>- Personenverwaltung: Erfassen, Bearbeiten, L</w:t>
+      </w:r>
+      <w:r>
+        <w:t>ö</w:t>
+      </w:r>
+      <w:r>
+        <w:t>schen (Name, Fachrichtung, Lehrbeginn)</w:t>
       </w:r>
     </w:p>
     <w:p>
@@ -146,27 +220,75 @@
     </w:p>
     <w:p>
       <w:r>
-        <w:t>- Kompetenzbewertung: Bloom-Stufen K0-K6 pro Leistungsziel mit Kommentarfeld und Aenderungsdatum</w:t>
-      </w:r>
-    </w:p>
-    <w:p>
-      <w:r>
-        <w:t>- Fortschrittsanzeige: Pro Bereich, Sub-Kompetenz und Gesamtuebersicht</w:t>
-      </w:r>
-    </w:p>
-    <w:p>
-      <w:r>
-        <w:t>- Erfuellungslogik: Leistungsziel gilt als erfuellt wenn Ist-Level &gt;= Ziel-Level (goal.max)</w:t>
-      </w:r>
-    </w:p>
-    <w:p>
-      <w:r>
-        <w:t>- PDF-Bericht: Farbkodierte Zielerreichung (Rot-Gelb-Gruen), Seitenzahlen, Legende</w:t>
-      </w:r>
-    </w:p>
-    <w:p>
-      <w:r>
-        <w:t>- JSON-Export und Datei-Dialog beim Oeffnen (File System Access API)</w:t>
+        <w:t xml:space="preserve">- Kompetenzbewertung: Bloom-Stufen K0-K6 pro Leistungsziel mit Kommentarfeld und </w:t>
+      </w:r>
+      <w:r>
+        <w:t>A</w:t>
+      </w:r>
+      <w:r>
+        <w:t>nderungsdatum</w:t>
+      </w:r>
+    </w:p>
+    <w:p>
+      <w:r>
+        <w:t>- Fortschrittsanzeige: Pro Bereich, Sub-Kompetenz und Gesamt</w:t>
+      </w:r>
+      <w:r>
+        <w:t>ü</w:t>
+      </w:r>
+      <w:r>
+        <w:t>bersicht</w:t>
+      </w:r>
+    </w:p>
+    <w:p>
+      <w:r>
+        <w:t>- Erf</w:t>
+      </w:r>
+      <w:r>
+        <w:t>ü</w:t>
+      </w:r>
+      <w:r>
+        <w:t xml:space="preserve">llungslogik: Leistungsziel gilt als </w:t>
+      </w:r>
+      <w:r>
+        <w:t>e</w:t>
+      </w:r>
+      <w:r>
+        <w:t>rf</w:t>
+      </w:r>
+      <w:r>
+        <w:t>ü</w:t>
+      </w:r>
+      <w:r>
+        <w:t>llt</w:t>
+      </w:r>
+      <w:r>
+        <w:t>,</w:t>
+      </w:r>
+      <w:r>
+        <w:t xml:space="preserve"> wenn Ist-Level &gt;= Ziel-Level (goal.max)</w:t>
+      </w:r>
+    </w:p>
+    <w:p>
+      <w:r>
+        <w:t>- PDF-Bericht: Farbkodierte Zielerreichung (Rot-Gelb-Gr</w:t>
+      </w:r>
+      <w:r>
+        <w:t>ü</w:t>
+      </w:r>
+      <w:r>
+        <w:t>n), Seitenzahlen, Legende</w:t>
+      </w:r>
+    </w:p>
+    <w:p>
+      <w:r>
+        <w:t xml:space="preserve">- JSON-Export und Datei-Dialog beim </w:t>
+      </w:r>
+      <w:r>
+        <w:t>Ö</w:t>
+      </w:r>
+      <w:r>
+        <w:t>ffnen (File System Access API)</w:t>
       </w:r>
     </w:p>
     <w:p>
@@ -180,17 +302,41 @@
     </w:p>
     <w:p>
       <w:r>
-        <w:t>GitHub-Integration: Evaluiert und entfernt. Zu komplex fuer Lernende (Token-Verwaltung). Ersetzt durch einfaches File-Handling auf dem Netzlaufwerk.</w:t>
-      </w:r>
-    </w:p>
-    <w:p>
-      <w:r>
-        <w:t>Fortschrittsberechnung: Leistungsziel gilt erst als erreicht wenn level &gt;= goal.max. Vorher war level &gt; 0 als erfuellt gezaehlt worden (falsch).</w:t>
-      </w:r>
-    </w:p>
-    <w:p>
-      <w:r>
-        <w:t>PDF-Bibliothek jsPDF: Unterstuetzt nur Latin-1, kein Unicode (z.B. &gt;= statt kleiner-gleich-Zeichen verwenden).</w:t>
+        <w:t>GitHub-Integration: Evaluiert und entfernt. Zu komplex f</w:t>
+      </w:r>
+      <w:r>
+        <w:t>ü</w:t>
+      </w:r>
+      <w:r>
+        <w:t>r Lernende (Token-Verwaltung). Ersetzt durch einfaches File-Handling auf dem Netzlaufwerk.</w:t>
+      </w:r>
+    </w:p>
+    <w:p>
+      <w:r>
+        <w:t>Fortschrittsberechnung: Leistungsziel gilt erst als erreicht wenn level &gt;= goal.max. Vorher war level &gt; 0 als erf</w:t>
+      </w:r>
+      <w:r>
+        <w:t>ü</w:t>
+      </w:r>
+      <w:r>
+        <w:t>llt gez</w:t>
+      </w:r>
+      <w:r>
+        <w:t>a</w:t>
+      </w:r>
+      <w:r>
+        <w:t>hlt worden (falsch).</w:t>
+      </w:r>
+    </w:p>
+    <w:p>
+      <w:r>
+        <w:t>PDF-Bibliothek jsPDF: Unterst</w:t>
+      </w:r>
+      <w:r>
+        <w:t>ü</w:t>
+      </w:r>
+      <w:r>
+        <w:t>tzt nur Latin-1, kein Unicode (z.B. &gt;= statt kleiner-gleich-Zeichen verwenden).</w:t>
       </w:r>
     </w:p>
     <w:p>
@@ -211,7 +357,19 @@
     </w:p>
     <w:p>
       <w:r>
-        <w:t>Der Umbau dient als Lernprojekt fuer Frontend/Backend-Entwicklung mit Synergie zum CAS AI-SE (Python als Lernsprache fuer KI).</w:t>
+        <w:t>Der Umbau dient als Lernprojekt f</w:t>
+      </w:r>
+      <w:r>
+        <w:t>ü</w:t>
+      </w:r>
+      <w:r>
+        <w:t>r Frontend/Backend-Entwicklung mit Synergie zum CAS AI-SE (Python als Lernsprache f</w:t>
+      </w:r>
+      <w:r>
+        <w:t>ü</w:t>
+      </w:r>
+      <w:r>
+        <w:t>r KI).</w:t>
       </w:r>
     </w:p>
     <w:p>
@@ -229,7 +387,13 @@
     </w:p>
     <w:p>
       <w:r>
-        <w:t xml:space="preserve">  frontend/              HTML-App (bestehend, spaeter modernisieren)</w:t>
+        <w:t xml:space="preserve">  frontend/              HTML-App (bestehend, sp</w:t>
+      </w:r>
+      <w:r>
+        <w:t>a</w:t>
+      </w:r>
+      <w:r>
+        <w:t>ter modernisieren)</w:t>
       </w:r>
     </w:p>
     <w:p>
@@ -276,13 +440,27 @@
       </w:r>
     </w:p>
     <w:p>
-      <w:r>
+      <w:pPr>
+        <w:rPr>
+          <w:lang w:val="en-US"/>
+        </w:rPr>
+      </w:pPr>
+      <w:r>
+        <w:rPr>
+          <w:lang w:val="en-US"/>
+        </w:rPr>
         <w:t>Tabelle Users: Id UNIQUEIDENTIFIER PK, Name NVARCHAR(100), Specialty (platform/app), StartDate DATE, CreatedAt DATETIME2</w:t>
       </w:r>
     </w:p>
     <w:p>
       <w:r>
-        <w:t>Tabelle GoalEntries: Id PK, UserId FK-&gt;Users (CASCADE DELETE), GoalId NVARCHAR(20) z.B. a1.1, Level TINYINT 0-6, Comment NVARCHAR(MAX), UpdatedAt DATETIME2. UNIQUE Constraint auf (UserId, GoalId).</w:t>
+        <w:rPr>
+          <w:lang w:val="en-US"/>
+        </w:rPr>
+        <w:t xml:space="preserve">Tabelle GoalEntries: Id PK, UserId FK-&gt;Users (CASCADE DELETE), GoalId NVARCHAR(20) z.B. a1.1, Level TINYINT 0-6, Comment NVARCHAR(MAX), UpdatedAt DATETIME2. </w:t>
+      </w:r>
+      <w:r>
+        <w:t>UNIQUE Constraint auf (UserId, GoalId).</w:t>
       </w:r>
     </w:p>
     <w:p>
@@ -290,7 +468,13 @@
         <w:pStyle w:val="berschrift3"/>
       </w:pPr>
       <w:r>
-        <w:t>Naechste Schritte</w:t>
+        <w:t>N</w:t>
+      </w:r>
+      <w:r>
+        <w:t>a</w:t>
+      </w:r>
+      <w:r>
+        <w:t>chste Schritte</w:t>
       </w:r>
     </w:p>
     <w:p>
@@ -299,13 +483,27 @@
       </w:r>
     </w:p>
     <w:p>
-      <w:r>
+      <w:pPr>
+        <w:rPr>
+          <w:lang w:val="en-US"/>
+        </w:rPr>
+      </w:pPr>
+      <w:r>
+        <w:rPr>
+          <w:lang w:val="en-US"/>
+        </w:rPr>
         <w:t>- Pakete: pip install fastapi uvicorn sqlalchemy pyodbc</w:t>
       </w:r>
     </w:p>
     <w:p>
       <w:r>
-        <w:t>- REST-Endpunkte implementieren: CRUD fuer Users und GoalEntries</w:t>
+        <w:t>- REST-Endpunkte implementieren: CRUD f</w:t>
+      </w:r>
+      <w:r>
+        <w:t>ü</w:t>
+      </w:r>
+      <w:r>
+        <w:t>r Users und GoalEntries</w:t>
       </w:r>
     </w:p>
     <w:p>
@@ -331,28 +529,94 @@
     </w:p>
     <w:p>
       <w:r>
-        <w:t>- Startup vereinfacht: Ein einziger Button Erlauben und Datei oeffnen. Hintergrund: Browser-Sicherheitsregel erfordert User-Geste vor File Picker.</w:t>
-      </w:r>
-    </w:p>
-    <w:p>
-      <w:r>
-        <w:t>- GitHub-Integration vollstaendig entfernt (war zu komplex fuer den Anwendungsfall, Token-Verwaltung fuer Lernende unpraktisch).</w:t>
-      </w:r>
-    </w:p>
-    <w:p>
-      <w:r>
-        <w:t>- Person wechseln: Bearbeiten und Loeschen direkt auf Personenkarten ergaenzt, mit Bestaetigung vor dem Loeschen.</w:t>
-      </w:r>
-    </w:p>
-    <w:p>
-      <w:r>
-        <w:t>- PDF-Export implementiert: jsPDF mit autotable, farbkodierte Zielerreichung Rot-Gelb-Gruen basierend auf Ist/Ziel-Verhaeltnis.</w:t>
+        <w:t xml:space="preserve">- Startup vereinfacht: Ein einziger Button Erlauben und Datei </w:t>
+      </w:r>
+      <w:r>
+        <w:t>ö</w:t>
+      </w:r>
+      <w:r>
+        <w:t>ffnen. Hintergrund: Browser-Sicherheitsregel erfordert User-Geste vor File Picker.</w:t>
+      </w:r>
+    </w:p>
+    <w:p>
+      <w:r>
+        <w:t>- GitHub-Integration vollst</w:t>
+      </w:r>
+      <w:r>
+        <w:t>a</w:t>
+      </w:r>
+      <w:r>
+        <w:t>ndig entfernt (war zu komplex f</w:t>
+      </w:r>
+      <w:r>
+        <w:t>ü</w:t>
+      </w:r>
+      <w:r>
+        <w:t>r den Anwendungsfall, Token-Verwaltung f</w:t>
+      </w:r>
+      <w:r>
+        <w:t>ü</w:t>
+      </w:r>
+      <w:r>
+        <w:t>r Lernende unpraktisch).</w:t>
+      </w:r>
+    </w:p>
+    <w:p>
+      <w:r>
+        <w:t>- Person wechseln: Bearbeiten und L</w:t>
+      </w:r>
+      <w:r>
+        <w:t>ö</w:t>
+      </w:r>
+      <w:r>
+        <w:t>schen direkt auf Personenkarten erg</w:t>
+      </w:r>
+      <w:r>
+        <w:t>a</w:t>
+      </w:r>
+      <w:r>
+        <w:t>nzt, mit Best</w:t>
+      </w:r>
+      <w:r>
+        <w:t>a</w:t>
+      </w:r>
+      <w:r>
+        <w:t>tigung vor dem L</w:t>
+      </w:r>
+      <w:r>
+        <w:t>ö</w:t>
+      </w:r>
+      <w:r>
+        <w:t>schen.</w:t>
+      </w:r>
+    </w:p>
+    <w:p>
+      <w:r>
+        <w:t>- PDF-Export implementiert: jsPDF mit autotable, farbkodierte Zielerreichung Rot-Gelb-Gr</w:t>
+      </w:r>
+      <w:r>
+        <w:t>ü</w:t>
+      </w:r>
+      <w:r>
+        <w:t>n basierend auf Ist/Ziel-Verh</w:t>
+      </w:r>
+      <w:r>
+        <w:t>a</w:t>
+      </w:r>
+      <w:r>
+        <w:t>ltnis.</w:t>
       </w:r>
     </w:p>
     <w:p>
       <w:r>
         <w:lastRenderedPageBreak/>
-        <w:t>- Fortschrittsberechnung korrigiert: level &gt;= goal.max statt level &gt; 0. Betrifft getAreaProgress(), getUserProgress() und Sub-Kompetenz-Zaehler.</w:t>
+        <w:t>- Fortschrittsberechnung korrigiert: level &gt;= goal.max statt level &gt; 0. Betrifft getAreaProgress(), getUserProgress() und Sub-Kompetenz-Z</w:t>
+      </w:r>
+      <w:r>
+        <w:t>a</w:t>
+      </w:r>
+      <w:r>
+        <w:t>hler.</w:t>
       </w:r>
     </w:p>
     <w:p>
@@ -365,7 +629,13 @@
     </w:p>
     <w:p>
       <w:r>
-        <w:t>- SQL Server 2022 Express installiert. Wichtig: Sprachversion muss mit Windows-Sprache uebereinstimmen (deutsch).</w:t>
+        <w:t xml:space="preserve">- SQL Server 2022 Express installiert. Wichtig: Sprachversion muss mit Windows-Sprache </w:t>
+      </w:r>
+      <w:r>
+        <w:t>ü</w:t>
+      </w:r>
+      <w:r>
+        <w:t>bereinstimmen (deutsch).</w:t>
       </w:r>
     </w:p>
     <w:p>
@@ -375,7 +645,19 @@
     </w:p>
     <w:p>
       <w:r>
-        <w:t>- Berechtigungsproblem geloest: SQL Server im Einzelbenutzermodus gestartet (net start MSSQL$SQLEXPRESS /m), eigenen User via sp_addsrvrolemember als sysadmin hinzugefuegt.</w:t>
+        <w:t>- Berechtigungsproblem gel</w:t>
+      </w:r>
+      <w:r>
+        <w:t>ö</w:t>
+      </w:r>
+      <w:r>
+        <w:t>st: SQL Server im Einzelbenutzermodus gestartet (net start MSSQL$SQLEXPRESS /m), eigenen User via sp_addsrvrolemember als sysadmin hinzugef</w:t>
+      </w:r>
+      <w:r>
+        <w:t>ü</w:t>
+      </w:r>
+      <w:r>
+        <w:t>gt.</w:t>
       </w:r>
     </w:p>
     <w:p>
@@ -395,7 +677,13 @@
     </w:p>
     <w:p>
       <w:r>
-        <w:t>- FHNW-Dokumentationstemplate aufgesetzt und mit bisherigen Inhalten befuellt.</w:t>
+        <w:t>- FHNW-Dokumentationstemplate aufgesetzt und mit bisherigen Inhalten bef</w:t>
+      </w:r>
+      <w:r>
+        <w:t>ü</w:t>
+      </w:r>
+      <w:r>
+        <w:t>llt.</w:t>
       </w:r>
     </w:p>
     <w:p>
@@ -435,7 +723,13 @@
     </w:p>
     <w:p>
       <w:r>
-        <w:t>Kurssprache: Deutsch. Durchfuehrungsort: FHNW, Brugg-Windisch (und remote).</w:t>
+        <w:t>Kurssprache: Deutsch. Durchf</w:t>
+      </w:r>
+      <w:r>
+        <w:t>ü</w:t>
+      </w:r>
+      <w:r>
+        <w:t>hrungsort: FHNW, Brugg-Windisch (und remote).</w:t>
       </w:r>
     </w:p>
     <w:p>
@@ -448,17 +742,41 @@
     </w:p>
     <w:p>
       <w:r>
-        <w:t>Das zentrale Leistungselement des CAS ist ein Hands-On Projekt, das ab dem ersten Kurstag gestartet wird. Es dient als Praxisnachweis und wird waehrend des gesamten Kursverlaufs weiterentwickelt.</w:t>
-      </w:r>
-    </w:p>
-    <w:p>
-      <w:r>
-        <w:t>Geplantes Projekt fuer den CAS-Leistungsnachweis: Kompetenz-Tracker mit KI-Erweiterung.</w:t>
-      </w:r>
-    </w:p>
-    <w:p>
-      <w:r>
-        <w:t>Idee: Den bestehenden Handlungskompetenz-Tracker (aktuell HTML + JSON + FastAPI/MSSQL) um KI-gestuetzte Funktionen erweitern – z.B. automatische Kompetenzstufen-Empfehlung, Lernfortschritt-Analyse oder natuerlichsprachige Auswertungen.</w:t>
+        <w:t>Das zentrale Leistungselement des CAS ist ein Hands-On Projekt, das ab dem ersten Kurstag gestartet wird. Es dient als Praxisnachweis und wird w</w:t>
+      </w:r>
+      <w:r>
+        <w:t>a</w:t>
+      </w:r>
+      <w:r>
+        <w:t>hrend des gesamten Kursverlaufs weiterentwickelt.</w:t>
+      </w:r>
+    </w:p>
+    <w:p>
+      <w:r>
+        <w:t>Geplantes Projekt f</w:t>
+      </w:r>
+      <w:r>
+        <w:t>ü</w:t>
+      </w:r>
+      <w:r>
+        <w:t>r den CAS-Leistungsnachweis: Kompetenz-Tracker mit KI-Erweiterung.</w:t>
+      </w:r>
+    </w:p>
+    <w:p>
+      <w:r>
+        <w:t>Idee: Den bestehenden Handlungskompetenz-Tracker (aktuell HTML + JSON + FastAPI/MSSQL) um KI-gest</w:t>
+      </w:r>
+      <w:r>
+        <w:t>ü</w:t>
+      </w:r>
+      <w:r>
+        <w:t>tzte Funktionen erweitern – z.B. automatische Kompetenzstufen-Empfehlung, Lernfortschritt-Analyse oder nat</w:t>
+      </w:r>
+      <w:r>
+        <w:t>ü</w:t>
+      </w:r>
+      <w:r>
+        <w:t>rlichsprachige Auswertungen.</w:t>
       </w:r>
     </w:p>
     <w:p>
@@ -466,7 +784,13 @@
         <w:pStyle w:val="berschrift2"/>
       </w:pPr>
       <w:r>
-        <w:t>Verbindung zum aktuellen Projekt</w:t>
+        <w:t>Verbindung zum akt</w:t>
+      </w:r>
+      <w:r>
+        <w:t>ü</w:t>
+      </w:r>
+      <w:r>
+        <w:t>llen Projekt</w:t>
       </w:r>
     </w:p>
     <w:p>
@@ -476,12 +800,47 @@
     </w:p>
     <w:p>
       <w:r>
-        <w:t xml:space="preserve">  1. Uebungsumgebung fuer Frontend/Backend-Erfahrung (Phase 2: FastAPI + MSSQL)</w:t>
-      </w:r>
-    </w:p>
-    <w:p>
-      <w:r>
-        <w:t xml:space="preserve">  2. Basis fuer das CAS Hands-On Projekt (Phase 3: KI-Integration)</w:t>
+        <w:t xml:space="preserve">  1. </w:t>
+      </w:r>
+      <w:r>
+        <w:t>Ü</w:t>
+      </w:r>
+      <w:r>
+        <w:t>bungsumgebung f</w:t>
+      </w:r>
+      <w:r>
+        <w:t>ü</w:t>
+      </w:r>
+      <w:r>
+        <w:t>r Frontend/Backend-Erfahrung (Phase 2: FastAPI + MSSQL)</w:t>
+      </w:r>
+    </w:p>
+    <w:p>
+      <w:pPr>
+        <w:rPr>
+          <w:lang w:val="en-US"/>
+        </w:rPr>
+      </w:pPr>
+      <w:r>
+        <w:t xml:space="preserve">  </w:t>
+      </w:r>
+      <w:r>
+        <w:rPr>
+          <w:lang w:val="en-US"/>
+        </w:rPr>
+        <w:t>2. Basis f</w:t>
+      </w:r>
+      <w:r>
+        <w:rPr>
+          <w:lang w:val="en-US"/>
+        </w:rPr>
+        <w:t>ü</w:t>
+      </w:r>
+      <w:r>
+        <w:rPr>
+          <w:lang w:val="en-US"/>
+        </w:rPr>
+        <w:t>r das CAS Hands-On Projekt (Phase 3: KI-Integration)</w:t>
       </w:r>
     </w:p>
     <w:p>
@@ -666,14 +1025,21 @@
     <w:p>
       <w:pPr>
         <w:pStyle w:val="berschrift1"/>
-      </w:pPr>
-      <w:r>
+        <w:rPr>
+          <w:lang w:val="en-US"/>
+        </w:rPr>
+      </w:pPr>
+      <w:r>
+        <w:rPr>
+          <w:lang w:val="en-US"/>
+        </w:rPr>
+        <w:lastRenderedPageBreak/>
         <w:t>Session 17 – 17. April 2026: FHNW Corporate-Identity-Redesign</w:t>
       </w:r>
     </w:p>
     <w:p>
       <w:r>
-        <w:t>In dieser Session wurde die Benutzeroberfläche des Handlungskompetenz-Trackers vollständig an das Corporate Identity der FHNW Nordwestschweiz angepasst. Ziel war eine professionelle, konsistente Gestaltung im FHNW-Design mit gelber Primärfarbe, Logo-Integration und einem responsiven Layout für Desktop und Mobile.</w:t>
+        <w:t>In dieser Session wurde die Benutzeroberfläche des Handlungskompetenz-Trackers vollständig an das Corporate Identity der FHNW angepasst. Ziel war eine professionelle, konsistente Gestaltung im FHNW-Design mit gelber Primärfarbe, Logo-Integration und einem responsiven Layout für Desktop und Mobile.</w:t>
       </w:r>
     </w:p>
     <w:p/>
@@ -744,13 +1110,14 @@
         <w:t>Die Übersichtsseite zeigt den Lehrzeit-Fortschritt, die Bereichskarten und das Gesamt-Tortendiagramm im FHNW-Design mit gelbem Header und gelber Sidebar.</w:t>
       </w:r>
     </w:p>
+    <w:p/>
     <w:p>
       <w:r>
         <w:rPr>
           <w:noProof/>
         </w:rPr>
         <w:drawing>
-          <wp:inline distT="0" distB="0" distL="0" distR="0" wp14:anchorId="51C4CFFB" wp14:editId="3A9AFB20">
+          <wp:inline distT="0" distB="0" distL="0" distR="0" wp14:anchorId="51C4CFFB" wp14:editId="4A062B07">
             <wp:extent cx="5040000" cy="3009997"/>
             <wp:effectExtent l="0" t="0" r="8255" b="0"/>
             <wp:docPr id="1269599319" name="Grafik 1"/>
@@ -809,8 +1176,9 @@
         <w:rPr>
           <w:noProof/>
         </w:rPr>
+        <w:lastRenderedPageBreak/>
         <w:drawing>
-          <wp:inline distT="0" distB="0" distL="0" distR="0" wp14:anchorId="67B54F66" wp14:editId="128CB225">
+          <wp:inline distT="0" distB="0" distL="0" distR="0" wp14:anchorId="67B54F66" wp14:editId="6689A830">
             <wp:extent cx="5040000" cy="3009997"/>
             <wp:effectExtent l="0" t="0" r="8255" b="0"/>
             <wp:docPr id="1915599821" name="Grafik 2"/>
@@ -896,6 +1264,362 @@
     <w:p>
       <w:r>
         <w:t>Das FHNW-Redesign zeigt, wie professionelles Corporate Identity durch gezielte CSS-Anpassungen und saubere Komponentenstruktur umgesetzt werden kann. Besonders wertvoll war die Erkenntnis, dass CSS Custom Properties (Variablen) die spätere Anpassung und Wartung des Designs erheblich vereinfachen. Die automatisierte Screenshot-Erstellung mit dem Headless-Browser-Modus von Microsoft Edge erwies sich als zuverlässige Methode zur Dokumentation von UI-Zuständen.</w:t>
+      </w:r>
+    </w:p>
+    <w:p>
+      <w:pPr>
+        <w:spacing w:after="200" w:line="276" w:lineRule="auto"/>
+      </w:pPr>
+      <w:r>
+        <w:br w:type="page"/>
+      </w:r>
+    </w:p>
+    <w:p>
+      <w:pPr>
+        <w:pStyle w:val="berschrift1"/>
+      </w:pPr>
+      <w:r>
+        <w:lastRenderedPageBreak/>
+        <w:t>Betrieb der Applikation – Startbefehle</w:t>
+      </w:r>
+    </w:p>
+    <w:p>
+      <w:r>
+        <w:t>Diese Übersicht listet alle Befehle auf, die als App-Owner zum Starten von Backend und Frontend benötigt werden.</w:t>
+      </w:r>
+    </w:p>
+    <w:p/>
+    <w:p>
+      <w:pPr>
+        <w:pStyle w:val="berschrift2"/>
+      </w:pPr>
+      <w:r>
+        <w:t>1. Backend starten (FastAPI)</w:t>
+      </w:r>
+    </w:p>
+    <w:p>
+      <w:r>
+        <w:t>Das Backend ist eine FastAPI-Anwendung (Python) und läuft lokal auf Port 8000. Es stellt die REST-API für Benutzerverwaltung, Zielspeicherung und Kompetenz-JSONs bereit.</w:t>
+      </w:r>
+    </w:p>
+    <w:p/>
+    <w:p>
+      <w:r>
+        <w:t>Arbeitsverzeichnis wechseln:</w:t>
+      </w:r>
+    </w:p>
+    <w:p>
+      <w:r>
+        <w:t>cd C:\Projekte\IT-Lehre Handlungskompetenzen\backend</w:t>
+      </w:r>
+    </w:p>
+    <w:p>
+      <w:r>
+        <w:t>Server starten:</w:t>
+      </w:r>
+    </w:p>
+    <w:p>
+      <w:r>
+        <w:t>uvicorn main:app --reload --host 127.0.0.1 --port 8000</w:t>
+      </w:r>
+    </w:p>
+    <w:p/>
+    <w:p>
+      <w:r>
+        <w:t>Voraussetzungen: Python installiert, Pakete installiert (einmalig):</w:t>
+      </w:r>
+    </w:p>
+    <w:p>
+      <w:r>
+        <w:t>pip install fastapi uvicorn sqlalchemy pyodbc</w:t>
+      </w:r>
+    </w:p>
+    <w:p/>
+    <w:p>
+      <w:r>
+        <w:t>API läuft danach unter: http://127.0.0.1:8000</w:t>
+      </w:r>
+    </w:p>
+    <w:p>
+      <w:r>
+        <w:t>Interaktive API-Dokumentation: http://127.0.0.1:8000/docs</w:t>
+      </w:r>
+    </w:p>
+    <w:p/>
+    <w:p>
+      <w:pPr>
+        <w:pStyle w:val="berschrift2"/>
+      </w:pPr>
+      <w:r>
+        <w:t>2. Frontend öffnen</w:t>
+      </w:r>
+    </w:p>
+    <w:p>
+      <w:r>
+        <w:t>Das Frontend ist eine einzelne HTML-Datei und kann direkt im Browser geöffnet werden – kein Webserver nötig:</w:t>
+      </w:r>
+    </w:p>
+    <w:p/>
+    <w:p>
+      <w:r>
+        <w:t>C:\Projekte\IT-Lehre Handlungskompetenzen\kompetenz-tracker.html</w:t>
+      </w:r>
+    </w:p>
+    <w:p/>
+    <w:p>
+      <w:r>
+        <w:t>Empfehlung: Datei im Windows Explorer doppelklicken oder per Rechtsklick &gt; Öffnen mit &gt; Microsoft Edge.</w:t>
+      </w:r>
+    </w:p>
+    <w:p/>
+    <w:p>
+      <w:pPr>
+        <w:pStyle w:val="berschrift2"/>
+      </w:pPr>
+      <w:r>
+        <w:t>3. Reihenfolge beim Start</w:t>
+      </w:r>
+    </w:p>
+    <w:p>
+      <w:r>
+        <w:t>1. Backend starten (uvicorn-Befehl im Terminal)</w:t>
+      </w:r>
+    </w:p>
+    <w:p>
+      <w:r>
+        <w:t>2. Warten bis im Terminal «Application startup complete» erscheint</w:t>
+      </w:r>
+    </w:p>
+    <w:p>
+      <w:r>
+        <w:t>3. kompetenz-tracker.html im Browser öffnen</w:t>
+      </w:r>
+    </w:p>
+    <w:p/>
+    <w:p>
+      <w:pPr>
+        <w:pStyle w:val="berschrift2"/>
+      </w:pPr>
+      <w:r>
+        <w:t>4. Hinweise</w:t>
+      </w:r>
+    </w:p>
+    <w:p>
+      <w:r>
+        <w:t>• SQL Server Express muss laufen (Instanz: localhost\SQLEXPRESS, Datenbank: KompetenzTracker)</w:t>
+      </w:r>
+    </w:p>
+    <w:p>
+      <w:r>
+        <w:t>• Windows-Authentifizierung wird verwendet – kein Passwort nötig</w:t>
+      </w:r>
+    </w:p>
+    <w:p>
+      <w:r>
+        <w:t>• Das Backend muss nicht neu gestartet werden, wenn nur das Frontend oder die JSON-Dateien geändert wurden</w:t>
+      </w:r>
+    </w:p>
+    <w:p>
+      <w:r>
+        <w:t>• Mit --reload startet uvicorn den Server automatisch neu bei Code-Änderungen im backend-Ordner</w:t>
+      </w:r>
+    </w:p>
+    <w:p>
+      <w:pPr>
+        <w:spacing w:after="200" w:line="276" w:lineRule="auto"/>
+      </w:pPr>
+      <w:r>
+        <w:br w:type="page"/>
+      </w:r>
+    </w:p>
+    <w:p>
+      <w:pPr>
+        <w:pStyle w:val="berschrift1"/>
+      </w:pPr>
+      <w:r>
+        <w:t>Betrieb der Applikation – Startbefehle</w:t>
+      </w:r>
+    </w:p>
+    <w:p>
+      <w:r>
+        <w:t>Diese Übersicht listet alle Befehle auf, die als App-Owner zum Starten von Backend und Frontend benötigt werden.</w:t>
+      </w:r>
+    </w:p>
+    <w:p/>
+    <w:p>
+      <w:pPr>
+        <w:pStyle w:val="berschrift2"/>
+      </w:pPr>
+      <w:r>
+        <w:t>1. Backend starten (FastAPI / uvicorn)</w:t>
+      </w:r>
+    </w:p>
+    <w:p>
+      <w:r>
+        <w:t>Das Backend ist eine Python-FastAPI-Anwendung und läuft lokal auf Port 8000. Es stellt die REST-API für Benutzer, Ziele und Kompetenz-JSONs bereit. SQL Server Express muss laufen (Instanz: localhost\SQLEXPRESS, DB: KompetenzTracker).</w:t>
+      </w:r>
+    </w:p>
+    <w:p/>
+    <w:p>
+      <w:r>
+        <w:t>Terminal öffnen und Verzeichnis wechseln:</w:t>
+      </w:r>
+    </w:p>
+    <w:p>
+      <w:pPr>
+        <w:spacing w:before="80" w:after="80"/>
+        <w:rPr>
+          <w:rFonts w:ascii="Courier New" w:hAnsi="Courier New" w:cs="Courier New"/>
+          <w:sz w:val="18"/>
+        </w:rPr>
+      </w:pPr>
+      <w:r>
+        <w:rPr>
+          <w:rFonts w:ascii="Courier New" w:hAnsi="Courier New" w:cs="Courier New"/>
+          <w:sz w:val="18"/>
+        </w:rPr>
+        <w:t>cd C:\Projekte\IT-Lehre Handlungskompetenzen\backend</w:t>
+      </w:r>
+    </w:p>
+    <w:p>
+      <w:r>
+        <w:t>Server starten:</w:t>
+      </w:r>
+    </w:p>
+    <w:p>
+      <w:pPr>
+        <w:spacing w:before="80" w:after="80"/>
+        <w:rPr>
+          <w:rFonts w:ascii="Courier New" w:hAnsi="Courier New" w:cs="Courier New"/>
+          <w:sz w:val="18"/>
+        </w:rPr>
+      </w:pPr>
+      <w:r>
+        <w:rPr>
+          <w:rFonts w:ascii="Courier New" w:hAnsi="Courier New" w:cs="Courier New"/>
+          <w:sz w:val="18"/>
+        </w:rPr>
+        <w:t>uvicorn main:app --reload --host 127.0.0.1 --port 8000</w:t>
+      </w:r>
+    </w:p>
+    <w:p>
+      <w:r>
+        <w:t>Einmalig – Pakete installieren (falls noch nicht geschehen):</w:t>
+      </w:r>
+    </w:p>
+    <w:p>
+      <w:pPr>
+        <w:spacing w:before="80" w:after="80"/>
+        <w:rPr>
+          <w:rFonts w:ascii="Courier New" w:hAnsi="Courier New" w:cs="Courier New"/>
+          <w:sz w:val="18"/>
+        </w:rPr>
+      </w:pPr>
+      <w:r>
+        <w:rPr>
+          <w:rFonts w:ascii="Courier New" w:hAnsi="Courier New" w:cs="Courier New"/>
+          <w:sz w:val="18"/>
+        </w:rPr>
+        <w:t>pip install fastapi uvicorn sqlalchemy pyodbc</w:t>
+      </w:r>
+    </w:p>
+    <w:p/>
+    <w:p>
+      <w:r>
+        <w:t>API läuft danach unter:  http://127.0.0.1:8000</w:t>
+      </w:r>
+    </w:p>
+    <w:p>
+      <w:r>
+        <w:t>Interaktive Doku (Swagger):  http://127.0.0.1:8000/docs</w:t>
+      </w:r>
+    </w:p>
+    <w:p/>
+    <w:p>
+      <w:pPr>
+        <w:pStyle w:val="berschrift2"/>
+      </w:pPr>
+      <w:r>
+        <w:t>2. Frontend öffnen</w:t>
+      </w:r>
+    </w:p>
+    <w:p>
+      <w:r>
+        <w:t>Das Frontend ist eine einzelne HTML-Datei – kein Webserver nötig. Einfach im Windows Explorer doppelklicken oder per Rechtsklick &gt; Öffnen mit &gt; Microsoft Edge:</w:t>
+      </w:r>
+    </w:p>
+    <w:p>
+      <w:pPr>
+        <w:spacing w:before="80" w:after="80"/>
+        <w:rPr>
+          <w:rFonts w:ascii="Courier New" w:hAnsi="Courier New" w:cs="Courier New"/>
+          <w:sz w:val="18"/>
+        </w:rPr>
+      </w:pPr>
+      <w:r>
+        <w:rPr>
+          <w:rFonts w:ascii="Courier New" w:hAnsi="Courier New" w:cs="Courier New"/>
+          <w:sz w:val="18"/>
+        </w:rPr>
+        <w:t>C:\Projekte\IT-Lehre Handlungskompetenzen\kompetenz-tracker.html</w:t>
+      </w:r>
+    </w:p>
+    <w:p/>
+    <w:p>
+      <w:pPr>
+        <w:pStyle w:val="berschrift2"/>
+      </w:pPr>
+      <w:r>
+        <w:t>3. Startreihenfolge</w:t>
+      </w:r>
+    </w:p>
+    <w:p>
+      <w:r>
+        <w:t>1.  SQL Server Express ist aktiv (Dienst läuft im Hintergrund)</w:t>
+      </w:r>
+    </w:p>
+    <w:p>
+      <w:r>
+        <w:t>2.  Backend starten: uvicorn-Befehl im Terminal ausführen</w:t>
+      </w:r>
+    </w:p>
+    <w:p>
+      <w:r>
+        <w:t>3.  Warten bis im Terminal «Application startup complete» erscheint</w:t>
+      </w:r>
+    </w:p>
+    <w:p>
+      <w:r>
+        <w:t>4.  kompetenz-tracker.html im Browser öffnen</w:t>
+      </w:r>
+    </w:p>
+    <w:p/>
+    <w:p>
+      <w:pPr>
+        <w:pStyle w:val="berschrift2"/>
+      </w:pPr>
+      <w:r>
+        <w:t>4. Hinweise</w:t>
+      </w:r>
+    </w:p>
+    <w:p>
+      <w:r>
+        <w:t>• Windows-Authentifizierung: kein Passwort nötig, der angemeldete Windows-User muss DB-Zugriff haben</w:t>
+      </w:r>
+    </w:p>
+    <w:p>
+      <w:r>
+        <w:t>• Das Backend muss nicht neu gestartet werden, wenn nur HTML oder JSON-Dateien geändert wurden</w:t>
+      </w:r>
+    </w:p>
+    <w:p>
+      <w:r>
+        <w:t>• Mit dem Flag --reload startet uvicorn automatisch neu bei Änderungen im backend-Ordner</w:t>
+      </w:r>
+    </w:p>
+    <w:p>
+      <w:r>
+        <w:t>• Die Datenbankverbindung ist in backend\database.py konfiguriert</w:t>
       </w:r>
     </w:p>
     <w:p/>
@@ -4740,7 +5464,7 @@
 
 <file path=word/webextensions/taskpanes.xml><?xml version="1.0" encoding="utf-8"?>
 <wetp:taskpanes xmlns:wetp="http://schemas.microsoft.com/office/webextensions/taskpanes/2010/11">
-  <wetp:taskpane dockstate="right" visibility="1" width="350" row="0">
+  <wetp:taskpane dockstate="right" visibility="1" width="350" row="2">
     <wetp:webextensionref xmlns:r="http://schemas.openxmlformats.org/officeDocument/2006/relationships" r:id="rId1"/>
   </wetp:taskpane>
 </wetp:taskpanes>
@@ -4772,6 +5496,15 @@
 </file>
 
 <file path=customXml/item2.xml><?xml version="1.0" encoding="utf-8"?>
+<?mso-contentType ?>
+<FormTemplates xmlns="http://schemas.microsoft.com/sharepoint/v3/contenttype/forms">
+  <Display>DocumentLibraryForm</Display>
+  <Edit>DocumentLibraryForm</Edit>
+  <New>DocumentLibraryForm</New>
+</FormTemplates>
+</file>
+
+<file path=customXml/item3.xml><?xml version="1.0" encoding="utf-8"?>
 <ct:contentTypeSchema xmlns:ct="http://schemas.microsoft.com/office/2006/metadata/contentType" xmlns:ma="http://schemas.microsoft.com/office/2006/metadata/properties/metaAttributes" ct:_="" ma:_="" ma:contentTypeName="Dokument" ma:contentTypeID="0x0101007903E6EB9CF02E4A9D445768F33CE8A0" ma:contentTypeVersion="10" ma:contentTypeDescription="Ein neues Dokument erstellen." ma:contentTypeScope="" ma:versionID="6ae922be011154ab15be9f8e392bd017">
   <xsd:schema xmlns:xsd="http://www.w3.org/2001/XMLSchema" xmlns:xs="http://www.w3.org/2001/XMLSchema" xmlns:p="http://schemas.microsoft.com/office/2006/metadata/properties" xmlns:ns2="9c9658b7-70b6-4a85-98d8-6fbbaa45c305" xmlns:ns3="469fef08-e3b5-4743-af2d-0bc6e31c71c1" targetNamespace="http://schemas.microsoft.com/office/2006/metadata/properties" ma:root="true" ma:fieldsID="d06d8b5c4036d08665a49476e2e0a1f7" ns2:_="" ns3:_="">
     <xsd:import namespace="9c9658b7-70b6-4a85-98d8-6fbbaa45c305"/>
@@ -4976,23 +5709,14 @@
 </ct:contentTypeSchema>
 </file>
 
-<file path=customXml/item3.xml><?xml version="1.0" encoding="utf-8"?>
-<?mso-contentType ?>
-<FormTemplates xmlns="http://schemas.microsoft.com/sharepoint/v3/contenttype/forms">
-  <Display>DocumentLibraryForm</Display>
-  <Edit>DocumentLibraryForm</Edit>
-  <New>DocumentLibraryForm</New>
-</FormTemplates>
+<file path=customXml/item4.xml><?xml version="1.0" encoding="utf-8"?>
+<b:Sources xmlns:b="http://schemas.openxmlformats.org/officeDocument/2006/bibliography" xmlns="http://schemas.openxmlformats.org/officeDocument/2006/bibliography" SelectedStyle="\APA.XSL" StyleName="APA"/>
 </file>
 
-<file path=customXml/item4.xml><?xml version="1.0" encoding="utf-8"?>
+<file path=customXml/item5.xml><?xml version="1.0" encoding="utf-8"?>
 <p:properties xmlns:p="http://schemas.microsoft.com/office/2006/metadata/properties" xmlns:xsi="http://www.w3.org/2001/XMLSchema-instance" xmlns:pc="http://schemas.microsoft.com/office/infopath/2007/PartnerControls">
   <documentManagement/>
 </p:properties>
-</file>
-
-<file path=customXml/item5.xml><?xml version="1.0" encoding="utf-8"?>
-<b:Sources xmlns:b="http://schemas.openxmlformats.org/officeDocument/2006/bibliography" xmlns="http://schemas.openxmlformats.org/officeDocument/2006/bibliography" SelectedStyle="\APA.XSL" StyleName="APA"/>
 </file>
 
 <file path=customXml/itemProps1.xml><?xml version="1.0" encoding="utf-8"?>
@@ -5004,6 +5728,14 @@
 </file>
 
 <file path=customXml/itemProps2.xml><?xml version="1.0" encoding="utf-8"?>
+<ds:datastoreItem xmlns:ds="http://schemas.openxmlformats.org/officeDocument/2006/customXml" ds:itemID="{D2CF7831-0288-43C5-9AFD-4D67A1E58A9C}">
+  <ds:schemaRefs>
+    <ds:schemaRef ds:uri="http://schemas.microsoft.com/sharepoint/v3/contenttype/forms"/>
+  </ds:schemaRefs>
+</ds:datastoreItem>
+</file>
+
+<file path=customXml/itemProps3.xml><?xml version="1.0" encoding="utf-8"?>
 <ds:datastoreItem xmlns:ds="http://schemas.openxmlformats.org/officeDocument/2006/customXml" ds:itemID="{6FA82E95-11C5-463A-AADD-8A833425D8D2}">
   <ds:schemaRefs>
     <ds:schemaRef ds:uri="http://schemas.microsoft.com/office/2006/metadata/contentType"/>
@@ -5022,27 +5754,19 @@
 </ds:datastoreItem>
 </file>
 
-<file path=customXml/itemProps3.xml><?xml version="1.0" encoding="utf-8"?>
-<ds:datastoreItem xmlns:ds="http://schemas.openxmlformats.org/officeDocument/2006/customXml" ds:itemID="{D2CF7831-0288-43C5-9AFD-4D67A1E58A9C}">
+<file path=customXml/itemProps4.xml><?xml version="1.0" encoding="utf-8"?>
+<ds:datastoreItem xmlns:ds="http://schemas.openxmlformats.org/officeDocument/2006/customXml" ds:itemID="{59CD317E-5156-4C3B-90E9-8DED7CA2EC5E}">
   <ds:schemaRefs>
-    <ds:schemaRef ds:uri="http://schemas.microsoft.com/sharepoint/v3/contenttype/forms"/>
+    <ds:schemaRef ds:uri="http://schemas.openxmlformats.org/officeDocument/2006/bibliography"/>
   </ds:schemaRefs>
 </ds:datastoreItem>
 </file>
 
-<file path=customXml/itemProps4.xml><?xml version="1.0" encoding="utf-8"?>
+<file path=customXml/itemProps5.xml><?xml version="1.0" encoding="utf-8"?>
 <ds:datastoreItem xmlns:ds="http://schemas.openxmlformats.org/officeDocument/2006/customXml" ds:itemID="{49D8654D-D35F-45A1-916C-E770D409409A}">
   <ds:schemaRefs>
     <ds:schemaRef ds:uri="http://schemas.microsoft.com/office/2006/metadata/properties"/>
     <ds:schemaRef ds:uri="http://schemas.microsoft.com/office/infopath/2007/PartnerControls"/>
   </ds:schemaRefs>
 </ds:datastoreItem>
-</file>
-
-<file path=customXml/itemProps5.xml><?xml version="1.0" encoding="utf-8"?>
-<ds:datastoreItem xmlns:ds="http://schemas.openxmlformats.org/officeDocument/2006/customXml" ds:itemID="{59CD317E-5156-4C3B-90E9-8DED7CA2EC5E}">
-  <ds:schemaRefs>
-    <ds:schemaRef ds:uri="http://schemas.openxmlformats.org/officeDocument/2006/bibliography"/>
-  </ds:schemaRefs>
-</ds:datastoreItem>
 </file>
</xml_diff>

<commit_message>
docs: React-Architektur Session 18 in Word-Dokumentation nachgeführt
- Projektstruktur (Ordnerbaum aller src-Dateien)
- Datenfluss und Komponentenhierarchie (ASCII-Baum)
- Jede Komponente einzeln beschrieben (Zuständigkeit, State, Abhängigkeiten)
- Gelernte React-Konzepte (useState, useEffect, Context, Router, Vite)
- Startbefehle für Backend und React-Frontend

Co-Authored-By: Claude Sonnet 4.6 <noreply@anthropic.com>
</commit_message>
<xml_diff>
--- a/doku/IT-Lehre Handlungskompetenen Doku.docx
+++ b/doku/IT-Lehre Handlungskompetenen Doku.docx
@@ -1117,7 +1117,7 @@
           <w:noProof/>
         </w:rPr>
         <w:drawing>
-          <wp:inline distT="0" distB="0" distL="0" distR="0" wp14:anchorId="51C4CFFB" wp14:editId="4A062B07">
+          <wp:inline distT="0" distB="0" distL="0" distR="0" wp14:anchorId="51C4CFFB" wp14:editId="1B6141C6">
             <wp:extent cx="5040000" cy="3009997"/>
             <wp:effectExtent l="0" t="0" r="8255" b="0"/>
             <wp:docPr id="1269599319" name="Grafik 1"/>
@@ -1178,7 +1178,7 @@
         </w:rPr>
         <w:lastRenderedPageBreak/>
         <w:drawing>
-          <wp:inline distT="0" distB="0" distL="0" distR="0" wp14:anchorId="67B54F66" wp14:editId="6689A830">
+          <wp:inline distT="0" distB="0" distL="0" distR="0" wp14:anchorId="67B54F66" wp14:editId="4DF71804">
             <wp:extent cx="5040000" cy="3009997"/>
             <wp:effectExtent l="0" t="0" r="8255" b="0"/>
             <wp:docPr id="1915599821" name="Grafik 2"/>
@@ -1437,6 +1437,7 @@
         <w:pStyle w:val="berschrift1"/>
       </w:pPr>
       <w:r>
+        <w:lastRenderedPageBreak/>
         <w:t>Betrieb der Applikation – Startbefehle</w:t>
       </w:r>
     </w:p>
@@ -1622,7 +1623,863 @@
         <w:t>• Die Datenbankverbindung ist in backend\database.py konfiguriert</w:t>
       </w:r>
     </w:p>
-    <w:p/>
+    <w:p>
+      <w:pPr>
+        <w:spacing w:after="200" w:line="276" w:lineRule="auto"/>
+      </w:pPr>
+      <w:r>
+        <w:br w:type="page"/>
+      </w:r>
+    </w:p>
+    <w:p>
+      <w:pPr>
+        <w:pStyle w:val="berschrift1"/>
+      </w:pPr>
+      <w:r>
+        <w:lastRenderedPageBreak/>
+        <w:t>React-Frontend – Architektur (Session 18)</w:t>
+      </w:r>
+    </w:p>
+    <w:p>
+      <w:r>
+        <w:t>In Session 18 wurde der HTML/JS-Prototyp in ein React-Frontend (Vite + react-router-dom) migriert. Die Migration dient als Lernprojekt für die Architekturprinzipien moderner Single-Page-Applications. Das FHNW Corporate Identity Design (gelber Header, gelbe Sidebar, Logo) wurde 1:1 übernommen. Das Backend (FastAPI + SQL Server) bleibt unverändert.</w:t>
+      </w:r>
+    </w:p>
+    <w:p>
+      <w:pPr>
+        <w:pStyle w:val="berschrift2"/>
+      </w:pPr>
+      <w:r>
+        <w:t>Projektstruktur</w:t>
+      </w:r>
+    </w:p>
+    <w:p>
+      <w:pPr>
+        <w:shd w:val="clear" w:color="auto" w:fill="E6E6E6"/>
+        <w:rPr>
+          <w:rFonts w:ascii="Courier New" w:hAnsi="Courier New" w:cs="Courier New"/>
+          <w:sz w:val="16"/>
+        </w:rPr>
+      </w:pPr>
+      <w:r>
+        <w:rPr>
+          <w:rFonts w:ascii="Courier New" w:hAnsi="Courier New" w:cs="Courier New"/>
+          <w:sz w:val="16"/>
+        </w:rPr>
+        <w:t>frontend/</w:t>
+      </w:r>
+    </w:p>
+    <w:p>
+      <w:pPr>
+        <w:shd w:val="clear" w:color="auto" w:fill="E6E6E6"/>
+        <w:rPr>
+          <w:rFonts w:ascii="Courier New" w:hAnsi="Courier New" w:cs="Courier New"/>
+          <w:sz w:val="16"/>
+        </w:rPr>
+      </w:pPr>
+      <w:r>
+        <w:rPr>
+          <w:rFonts w:ascii="Courier New" w:hAnsi="Courier New" w:cs="Courier New"/>
+          <w:sz w:val="16"/>
+        </w:rPr>
+        <w:t xml:space="preserve">  public/          – Statische Assets (FHNW_Logo.webp, IconBuch.png, IconPDF.png)</w:t>
+      </w:r>
+    </w:p>
+    <w:p>
+      <w:pPr>
+        <w:shd w:val="clear" w:color="auto" w:fill="E6E6E6"/>
+        <w:rPr>
+          <w:rFonts w:ascii="Courier New" w:hAnsi="Courier New" w:cs="Courier New"/>
+          <w:sz w:val="16"/>
+        </w:rPr>
+      </w:pPr>
+      <w:r>
+        <w:rPr>
+          <w:rFonts w:ascii="Courier New" w:hAnsi="Courier New" w:cs="Courier New"/>
+          <w:sz w:val="16"/>
+        </w:rPr>
+        <w:t xml:space="preserve">  src/</w:t>
+      </w:r>
+    </w:p>
+    <w:p>
+      <w:pPr>
+        <w:shd w:val="clear" w:color="auto" w:fill="E6E6E6"/>
+        <w:rPr>
+          <w:rFonts w:ascii="Courier New" w:hAnsi="Courier New" w:cs="Courier New"/>
+          <w:sz w:val="16"/>
+        </w:rPr>
+      </w:pPr>
+      <w:r>
+        <w:rPr>
+          <w:rFonts w:ascii="Courier New" w:hAnsi="Courier New" w:cs="Courier New"/>
+          <w:sz w:val="16"/>
+        </w:rPr>
+        <w:t xml:space="preserve">    main.jsx        – Einstiegspunkt: rendert &lt;App /&gt; in #root</w:t>
+      </w:r>
+    </w:p>
+    <w:p>
+      <w:pPr>
+        <w:shd w:val="clear" w:color="auto" w:fill="E6E6E6"/>
+        <w:rPr>
+          <w:rFonts w:ascii="Courier New" w:hAnsi="Courier New" w:cs="Courier New"/>
+          <w:sz w:val="16"/>
+        </w:rPr>
+      </w:pPr>
+      <w:r>
+        <w:rPr>
+          <w:rFonts w:ascii="Courier New" w:hAnsi="Courier New" w:cs="Courier New"/>
+          <w:sz w:val="16"/>
+        </w:rPr>
+        <w:t xml:space="preserve">    App.jsx         – Router-Setup, App-Shell (Header + Sidebar + Routes)</w:t>
+      </w:r>
+    </w:p>
+    <w:p>
+      <w:pPr>
+        <w:shd w:val="clear" w:color="auto" w:fill="E6E6E6"/>
+        <w:rPr>
+          <w:rFonts w:ascii="Courier New" w:hAnsi="Courier New" w:cs="Courier New"/>
+          <w:sz w:val="16"/>
+        </w:rPr>
+      </w:pPr>
+      <w:r>
+        <w:rPr>
+          <w:rFonts w:ascii="Courier New" w:hAnsi="Courier New" w:cs="Courier New"/>
+          <w:sz w:val="16"/>
+        </w:rPr>
+        <w:t xml:space="preserve">    index.css       – Globales CSS (FHNW CI, alle Komponenten-Klassen)</w:t>
+      </w:r>
+    </w:p>
+    <w:p>
+      <w:pPr>
+        <w:shd w:val="clear" w:color="auto" w:fill="E6E6E6"/>
+        <w:rPr>
+          <w:rFonts w:ascii="Courier New" w:hAnsi="Courier New" w:cs="Courier New"/>
+          <w:sz w:val="16"/>
+        </w:rPr>
+      </w:pPr>
+      <w:r>
+        <w:rPr>
+          <w:rFonts w:ascii="Courier New" w:hAnsi="Courier New" w:cs="Courier New"/>
+          <w:sz w:val="16"/>
+        </w:rPr>
+        <w:t xml:space="preserve">    App.css         – Leer (bewusst)</w:t>
+      </w:r>
+    </w:p>
+    <w:p>
+      <w:pPr>
+        <w:shd w:val="clear" w:color="auto" w:fill="E6E6E6"/>
+        <w:rPr>
+          <w:rFonts w:ascii="Courier New" w:hAnsi="Courier New" w:cs="Courier New"/>
+          <w:sz w:val="16"/>
+        </w:rPr>
+      </w:pPr>
+      <w:r>
+        <w:rPr>
+          <w:rFonts w:ascii="Courier New" w:hAnsi="Courier New" w:cs="Courier New"/>
+          <w:sz w:val="16"/>
+        </w:rPr>
+        <w:t xml:space="preserve">    api/</w:t>
+      </w:r>
+    </w:p>
+    <w:p>
+      <w:pPr>
+        <w:shd w:val="clear" w:color="auto" w:fill="E6E6E6"/>
+        <w:rPr>
+          <w:rFonts w:ascii="Courier New" w:hAnsi="Courier New" w:cs="Courier New"/>
+          <w:sz w:val="16"/>
+        </w:rPr>
+      </w:pPr>
+      <w:r>
+        <w:rPr>
+          <w:rFonts w:ascii="Courier New" w:hAnsi="Courier New" w:cs="Courier New"/>
+          <w:sz w:val="16"/>
+        </w:rPr>
+        <w:t xml:space="preserve">      client.js     – Fetch-Wrapper für alle Backend-Endpunkte</w:t>
+      </w:r>
+    </w:p>
+    <w:p>
+      <w:pPr>
+        <w:shd w:val="clear" w:color="auto" w:fill="E6E6E6"/>
+        <w:rPr>
+          <w:rFonts w:ascii="Courier New" w:hAnsi="Courier New" w:cs="Courier New"/>
+          <w:sz w:val="16"/>
+        </w:rPr>
+      </w:pPr>
+      <w:r>
+        <w:rPr>
+          <w:rFonts w:ascii="Courier New" w:hAnsi="Courier New" w:cs="Courier New"/>
+          <w:sz w:val="16"/>
+        </w:rPr>
+        <w:t xml:space="preserve">    context/</w:t>
+      </w:r>
+    </w:p>
+    <w:p>
+      <w:pPr>
+        <w:shd w:val="clear" w:color="auto" w:fill="E6E6E6"/>
+        <w:rPr>
+          <w:rFonts w:ascii="Courier New" w:hAnsi="Courier New" w:cs="Courier New"/>
+          <w:sz w:val="16"/>
+        </w:rPr>
+      </w:pPr>
+      <w:r>
+        <w:rPr>
+          <w:rFonts w:ascii="Courier New" w:hAnsi="Courier New" w:cs="Courier New"/>
+          <w:sz w:val="16"/>
+        </w:rPr>
+        <w:t xml:space="preserve">      AppContext.jsx – Globaler State (React Context API)</w:t>
+      </w:r>
+    </w:p>
+    <w:p>
+      <w:pPr>
+        <w:shd w:val="clear" w:color="auto" w:fill="E6E6E6"/>
+        <w:rPr>
+          <w:rFonts w:ascii="Courier New" w:hAnsi="Courier New" w:cs="Courier New"/>
+          <w:sz w:val="16"/>
+        </w:rPr>
+      </w:pPr>
+      <w:r>
+        <w:rPr>
+          <w:rFonts w:ascii="Courier New" w:hAnsi="Courier New" w:cs="Courier New"/>
+          <w:sz w:val="16"/>
+        </w:rPr>
+        <w:t xml:space="preserve">    components/</w:t>
+      </w:r>
+    </w:p>
+    <w:p>
+      <w:pPr>
+        <w:shd w:val="clear" w:color="auto" w:fill="E6E6E6"/>
+        <w:rPr>
+          <w:rFonts w:ascii="Courier New" w:hAnsi="Courier New" w:cs="Courier New"/>
+          <w:sz w:val="16"/>
+        </w:rPr>
+      </w:pPr>
+      <w:r>
+        <w:rPr>
+          <w:rFonts w:ascii="Courier New" w:hAnsi="Courier New" w:cs="Courier New"/>
+          <w:sz w:val="16"/>
+        </w:rPr>
+        <w:t xml:space="preserve">      Header.jsx    – Gelber Header, User-Info, Wechseln-Dropdown</w:t>
+      </w:r>
+    </w:p>
+    <w:p>
+      <w:pPr>
+        <w:shd w:val="clear" w:color="auto" w:fill="E6E6E6"/>
+        <w:rPr>
+          <w:rFonts w:ascii="Courier New" w:hAnsi="Courier New" w:cs="Courier New"/>
+          <w:sz w:val="16"/>
+        </w:rPr>
+      </w:pPr>
+      <w:r>
+        <w:rPr>
+          <w:rFonts w:ascii="Courier New" w:hAnsi="Courier New" w:cs="Courier New"/>
+          <w:sz w:val="16"/>
+        </w:rPr>
+        <w:t xml:space="preserve">      Sidebar.jsx   – Gelbe Sidebar, Navigation, Bereichsliste</w:t>
+      </w:r>
+    </w:p>
+    <w:p>
+      <w:pPr>
+        <w:shd w:val="clear" w:color="auto" w:fill="E6E6E6"/>
+        <w:rPr>
+          <w:rFonts w:ascii="Courier New" w:hAnsi="Courier New" w:cs="Courier New"/>
+          <w:sz w:val="16"/>
+        </w:rPr>
+      </w:pPr>
+      <w:r>
+        <w:rPr>
+          <w:rFonts w:ascii="Courier New" w:hAnsi="Courier New" w:cs="Courier New"/>
+          <w:sz w:val="16"/>
+        </w:rPr>
+        <w:t xml:space="preserve">      UserModal.jsx – Modal: Lernende erfassen / bearbeiten</w:t>
+      </w:r>
+    </w:p>
+    <w:p>
+      <w:pPr>
+        <w:shd w:val="clear" w:color="auto" w:fill="E6E6E6"/>
+        <w:rPr>
+          <w:rFonts w:ascii="Courier New" w:hAnsi="Courier New" w:cs="Courier New"/>
+          <w:sz w:val="16"/>
+        </w:rPr>
+      </w:pPr>
+      <w:r>
+        <w:rPr>
+          <w:rFonts w:ascii="Courier New" w:hAnsi="Courier New" w:cs="Courier New"/>
+          <w:sz w:val="16"/>
+        </w:rPr>
+        <w:t xml:space="preserve">      GoalRow.jsx   – Einzelne Zeile eines Leistungsziels</w:t>
+      </w:r>
+    </w:p>
+    <w:p>
+      <w:pPr>
+        <w:shd w:val="clear" w:color="auto" w:fill="E6E6E6"/>
+        <w:rPr>
+          <w:rFonts w:ascii="Courier New" w:hAnsi="Courier New" w:cs="Courier New"/>
+          <w:sz w:val="16"/>
+        </w:rPr>
+      </w:pPr>
+      <w:r>
+        <w:rPr>
+          <w:rFonts w:ascii="Courier New" w:hAnsi="Courier New" w:cs="Courier New"/>
+          <w:sz w:val="16"/>
+        </w:rPr>
+        <w:t xml:space="preserve">      DonutChart.jsx – SVG-Donut-Diagramm für Gesamtfortschritt</w:t>
+      </w:r>
+    </w:p>
+    <w:p>
+      <w:pPr>
+        <w:shd w:val="clear" w:color="auto" w:fill="E6E6E6"/>
+        <w:rPr>
+          <w:rFonts w:ascii="Courier New" w:hAnsi="Courier New" w:cs="Courier New"/>
+          <w:sz w:val="16"/>
+        </w:rPr>
+      </w:pPr>
+      <w:r>
+        <w:rPr>
+          <w:rFonts w:ascii="Courier New" w:hAnsi="Courier New" w:cs="Courier New"/>
+          <w:sz w:val="16"/>
+        </w:rPr>
+        <w:t xml:space="preserve">      TopBar.jsx    – (veraltet, nicht mehr genutzt)</w:t>
+      </w:r>
+    </w:p>
+    <w:p>
+      <w:pPr>
+        <w:shd w:val="clear" w:color="auto" w:fill="E6E6E6"/>
+        <w:rPr>
+          <w:rFonts w:ascii="Courier New" w:hAnsi="Courier New" w:cs="Courier New"/>
+          <w:sz w:val="16"/>
+        </w:rPr>
+      </w:pPr>
+      <w:r>
+        <w:rPr>
+          <w:rFonts w:ascii="Courier New" w:hAnsi="Courier New" w:cs="Courier New"/>
+          <w:sz w:val="16"/>
+        </w:rPr>
+        <w:t xml:space="preserve">    pages/</w:t>
+      </w:r>
+    </w:p>
+    <w:p>
+      <w:pPr>
+        <w:shd w:val="clear" w:color="auto" w:fill="E6E6E6"/>
+        <w:rPr>
+          <w:rFonts w:ascii="Courier New" w:hAnsi="Courier New" w:cs="Courier New"/>
+          <w:sz w:val="16"/>
+        </w:rPr>
+      </w:pPr>
+      <w:r>
+        <w:rPr>
+          <w:rFonts w:ascii="Courier New" w:hAnsi="Courier New" w:cs="Courier New"/>
+          <w:sz w:val="16"/>
+        </w:rPr>
+        <w:t xml:space="preserve">      Overview.jsx  – Übersichtsseite (Lehrzeit, Kacheln, Pie-Chart)</w:t>
+      </w:r>
+    </w:p>
+    <w:p>
+      <w:pPr>
+        <w:shd w:val="clear" w:color="auto" w:fill="E6E6E6"/>
+        <w:rPr>
+          <w:rFonts w:ascii="Courier New" w:hAnsi="Courier New" w:cs="Courier New"/>
+          <w:sz w:val="16"/>
+        </w:rPr>
+      </w:pPr>
+      <w:r>
+        <w:rPr>
+          <w:rFonts w:ascii="Courier New" w:hAnsi="Courier New" w:cs="Courier New"/>
+          <w:sz w:val="16"/>
+        </w:rPr>
+        <w:t xml:space="preserve">      AreaView.jsx  – Bereichsdetail (Akkordeons, GoalRows)</w:t>
+      </w:r>
+    </w:p>
+    <w:p>
+      <w:pPr>
+        <w:shd w:val="clear" w:color="auto" w:fill="E6E6E6"/>
+        <w:rPr>
+          <w:rFonts w:ascii="Courier New" w:hAnsi="Courier New" w:cs="Courier New"/>
+          <w:sz w:val="16"/>
+        </w:rPr>
+      </w:pPr>
+      <w:r>
+        <w:rPr>
+          <w:rFonts w:ascii="Courier New" w:hAnsi="Courier New" w:cs="Courier New"/>
+          <w:sz w:val="16"/>
+        </w:rPr>
+        <w:t xml:space="preserve">    utils.js        – Gemeinsame Hilfsfunktionen und Konstanten</w:t>
+      </w:r>
+    </w:p>
+    <w:p>
+      <w:pPr>
+        <w:pStyle w:val="berschrift2"/>
+      </w:pPr>
+      <w:r>
+        <w:t>Datenfluss und Komponentenhierarchie</w:t>
+      </w:r>
+    </w:p>
+    <w:p>
+      <w:r>
+        <w:t>Beim Start lädt AppContext.jsx alle Daten vom Backend (beide Kompetenz-JSONs + alle User mit Goals) und stellt sie über den useApp()-Hook allen Komponenten zur Verfügung. Kein Prop-Drilling nötig.</w:t>
+      </w:r>
+    </w:p>
+    <w:p>
+      <w:pPr>
+        <w:shd w:val="clear" w:color="auto" w:fill="E6E6E6"/>
+        <w:rPr>
+          <w:rFonts w:ascii="Courier New" w:hAnsi="Courier New" w:cs="Courier New"/>
+          <w:sz w:val="16"/>
+        </w:rPr>
+      </w:pPr>
+      <w:r>
+        <w:rPr>
+          <w:rFonts w:ascii="Courier New" w:hAnsi="Courier New" w:cs="Courier New"/>
+          <w:sz w:val="16"/>
+        </w:rPr>
+        <w:t>main.jsx</w:t>
+      </w:r>
+    </w:p>
+    <w:p>
+      <w:pPr>
+        <w:shd w:val="clear" w:color="auto" w:fill="E6E6E6"/>
+        <w:rPr>
+          <w:rFonts w:ascii="Courier New" w:hAnsi="Courier New" w:cs="Courier New"/>
+          <w:sz w:val="16"/>
+        </w:rPr>
+      </w:pPr>
+      <w:r>
+        <w:rPr>
+          <w:rFonts w:ascii="Courier New" w:hAnsi="Courier New" w:cs="Courier New"/>
+          <w:sz w:val="16"/>
+        </w:rPr>
+        <w:t xml:space="preserve">  └── App.jsx  [AppProvider + BrowserRouter]</w:t>
+      </w:r>
+    </w:p>
+    <w:p>
+      <w:pPr>
+        <w:shd w:val="clear" w:color="auto" w:fill="E6E6E6"/>
+        <w:rPr>
+          <w:rFonts w:ascii="Courier New" w:hAnsi="Courier New" w:cs="Courier New"/>
+          <w:sz w:val="16"/>
+        </w:rPr>
+      </w:pPr>
+      <w:r>
+        <w:rPr>
+          <w:rFonts w:ascii="Courier New" w:hAnsi="Courier New" w:cs="Courier New"/>
+          <w:sz w:val="16"/>
+        </w:rPr>
+        <w:t xml:space="preserve">        ├── Header.jsx          liest: users, currentUser, areas</w:t>
+      </w:r>
+    </w:p>
+    <w:p>
+      <w:pPr>
+        <w:shd w:val="clear" w:color="auto" w:fill="E6E6E6"/>
+        <w:rPr>
+          <w:rFonts w:ascii="Courier New" w:hAnsi="Courier New" w:cs="Courier New"/>
+          <w:sz w:val="16"/>
+        </w:rPr>
+      </w:pPr>
+      <w:r>
+        <w:rPr>
+          <w:rFonts w:ascii="Courier New" w:hAnsi="Courier New" w:cs="Courier New"/>
+          <w:sz w:val="16"/>
+        </w:rPr>
+        <w:t xml:space="preserve">        │     └── UserModal.jsx  schreibt: addUser, editUser, removeUser</w:t>
+      </w:r>
+    </w:p>
+    <w:p>
+      <w:pPr>
+        <w:shd w:val="clear" w:color="auto" w:fill="E6E6E6"/>
+        <w:rPr>
+          <w:rFonts w:ascii="Courier New" w:hAnsi="Courier New" w:cs="Courier New"/>
+          <w:sz w:val="16"/>
+        </w:rPr>
+      </w:pPr>
+      <w:r>
+        <w:rPr>
+          <w:rFonts w:ascii="Courier New" w:hAnsi="Courier New" w:cs="Courier New"/>
+          <w:sz w:val="16"/>
+        </w:rPr>
+        <w:t xml:space="preserve">        ├── Sidebar.jsx         liest: currentUser, areas</w:t>
+      </w:r>
+    </w:p>
+    <w:p>
+      <w:pPr>
+        <w:shd w:val="clear" w:color="auto" w:fill="E6E6E6"/>
+        <w:rPr>
+          <w:rFonts w:ascii="Courier New" w:hAnsi="Courier New" w:cs="Courier New"/>
+          <w:sz w:val="16"/>
+        </w:rPr>
+      </w:pPr>
+      <w:r>
+        <w:rPr>
+          <w:rFonts w:ascii="Courier New" w:hAnsi="Courier New" w:cs="Courier New"/>
+          <w:sz w:val="16"/>
+        </w:rPr>
+        <w:t xml:space="preserve">        └── Routes</w:t>
+      </w:r>
+    </w:p>
+    <w:p>
+      <w:pPr>
+        <w:shd w:val="clear" w:color="auto" w:fill="E6E6E6"/>
+        <w:rPr>
+          <w:rFonts w:ascii="Courier New" w:hAnsi="Courier New" w:cs="Courier New"/>
+          <w:sz w:val="16"/>
+        </w:rPr>
+      </w:pPr>
+      <w:r>
+        <w:rPr>
+          <w:rFonts w:ascii="Courier New" w:hAnsi="Courier New" w:cs="Courier New"/>
+          <w:sz w:val="16"/>
+        </w:rPr>
+        <w:t xml:space="preserve">              ├── Overview.jsx  liest: currentUser, areas, goals</w:t>
+      </w:r>
+    </w:p>
+    <w:p>
+      <w:pPr>
+        <w:shd w:val="clear" w:color="auto" w:fill="E6E6E6"/>
+        <w:rPr>
+          <w:rFonts w:ascii="Courier New" w:hAnsi="Courier New" w:cs="Courier New"/>
+          <w:sz w:val="16"/>
+        </w:rPr>
+      </w:pPr>
+      <w:r>
+        <w:rPr>
+          <w:rFonts w:ascii="Courier New" w:hAnsi="Courier New" w:cs="Courier New"/>
+          <w:sz w:val="16"/>
+        </w:rPr>
+        <w:t xml:space="preserve">              │     └── DonutChart.jsx  (reine Darstellung, keine State)</w:t>
+      </w:r>
+    </w:p>
+    <w:p>
+      <w:pPr>
+        <w:shd w:val="clear" w:color="auto" w:fill="E6E6E6"/>
+        <w:rPr>
+          <w:rFonts w:ascii="Courier New" w:hAnsi="Courier New" w:cs="Courier New"/>
+          <w:sz w:val="16"/>
+        </w:rPr>
+      </w:pPr>
+      <w:r>
+        <w:rPr>
+          <w:rFonts w:ascii="Courier New" w:hAnsi="Courier New" w:cs="Courier New"/>
+          <w:sz w:val="16"/>
+        </w:rPr>
+        <w:t xml:space="preserve">              └── AreaView.jsx  liest: currentUser, areas</w:t>
+      </w:r>
+    </w:p>
+    <w:p>
+      <w:pPr>
+        <w:shd w:val="clear" w:color="auto" w:fill="E6E6E6"/>
+        <w:rPr>
+          <w:rFonts w:ascii="Courier New" w:hAnsi="Courier New" w:cs="Courier New"/>
+          <w:sz w:val="16"/>
+        </w:rPr>
+      </w:pPr>
+      <w:r>
+        <w:rPr>
+          <w:rFonts w:ascii="Courier New" w:hAnsi="Courier New" w:cs="Courier New"/>
+          <w:sz w:val="16"/>
+        </w:rPr>
+        <w:t xml:space="preserve">                    └── GoalRow.jsx  liest+schreibt: goal, updateGoal()</w:t>
+      </w:r>
+    </w:p>
+    <w:p>
+      <w:pPr>
+        <w:pStyle w:val="berschrift2"/>
+      </w:pPr>
+      <w:r>
+        <w:t>Komponenten im Detail</w:t>
+      </w:r>
+    </w:p>
+    <w:p>
+      <w:pPr>
+        <w:pStyle w:val="berschrift3"/>
+      </w:pPr>
+      <w:r>
+        <w:t>api/client.js</w:t>
+      </w:r>
+    </w:p>
+    <w:p>
+      <w:r>
+        <w:t>Dünner Fetch-Wrapper über alle Backend-REST-Endpunkte. Exportiert das api-Objekt mit den Methoden getCompetencies, getUsers, createUser, updateUser, deleteUser, getGoals, saveGoal. Kein State, keine React-Abhängigkeit.</w:t>
+      </w:r>
+    </w:p>
+    <w:p>
+      <w:pPr>
+        <w:pStyle w:val="berschrift3"/>
+      </w:pPr>
+      <w:r>
+        <w:t>context/AppContext.jsx</w:t>
+      </w:r>
+    </w:p>
+    <w:p>
+      <w:r>
+        <w:t>Herzstück der App. Lädt beim Start parallel beide Kompetenz-JSONs (Informatiker EFZ + ICT-Fachmann EFZ) und alle User mit Goals vom Backend. Filtert die sichtbaren Bereiche abhängig von der Fachrichtung des aktuellen Users (Plattform/App = gefiltert, ICT-Fachmann = alle). Stellt über useApp() bereit: users, currentUser, areas, loading, error, selectUser, updateGoal, addUser, editUser, removeUser.</w:t>
+      </w:r>
+    </w:p>
+    <w:p>
+      <w:pPr>
+        <w:pStyle w:val="berschrift3"/>
+      </w:pPr>
+      <w:r>
+        <w:t>utils.js</w:t>
+      </w:r>
+    </w:p>
+    <w:p>
+      <w:r>
+        <w:t>Gemeinsame Hilfsfunktionen ohne UI: getInitials(name), getLehrjahrInfo(user) – berechnet Lehrjahr und Fortschrittsprozente (3 Jahre für ICT-Fachmann, 4 Jahre für Informatiker), getAreaProgress(area, goals), getOverallProgress(areas, goals). Konstanten: BLOOM (K-Level-Labels), SPECIALTY_LABEL.</w:t>
+      </w:r>
+    </w:p>
+    <w:p>
+      <w:pPr>
+        <w:pStyle w:val="berschrift3"/>
+      </w:pPr>
+      <w:r>
+        <w:t>components/Header.jsx</w:t>
+      </w:r>
+    </w:p>
+    <w:p>
+      <w:r>
+        <w:t>Gelber Header über die gesamte Bildschirmbreite. Links: FHNW_Logo.webp im Bereich gleicher Breite wie die Sidebar. Mitte: App-Titel. Rechts: Avatar + Name + Fachrichtung des aktuellen Users, Lehrjahr-Badge (dunkel), Fortschrittsring (SVG), Wechseln-Dropdown (User-Liste mit Edit-Icon, + Lernende erfassen), PDF-Icon. Öffnet UserModal für Neu/Bearbeiten.</w:t>
+      </w:r>
+    </w:p>
+    <w:p>
+      <w:pPr>
+        <w:pStyle w:val="berschrift3"/>
+      </w:pPr>
+      <w:r>
+        <w:t>components/Sidebar.jsx</w:t>
+      </w:r>
+    </w:p>
+    <w:p>
+      <w:r>
+        <w:t>Gelbe Sidebar unterhalb des Headers. Zeigt App-Titel mit aktueller Fachrichtung, Navigation (Übersicht mit IconBuch.png), Bereichsliste (Buchstabe + Name + %-Badge in Dunkel, grün wenn 100%). Aktiver Eintrag weiss hinterlegt. Navigation via react-router-dom useNavigate.</w:t>
+      </w:r>
+    </w:p>
+    <w:p>
+      <w:pPr>
+        <w:pStyle w:val="berschrift3"/>
+      </w:pPr>
+      <w:r>
+        <w:t>components/UserModal.jsx</w:t>
+      </w:r>
+    </w:p>
+    <w:p>
+      <w:r>
+        <w:t>Modal zum Erfassen und Bearbeiten von Lernenden. Felder: Name, Ausbildung (3-Karten-Auswahl: Applikationsentwicklung, Plattformentwicklung, ICT-Fachmann/-frau), Lehrbeginn (Datum). Im Edit-Modus: Löschen-Button mit Bestätigung. Ruft addUser oder editUser aus AppContext auf.</w:t>
+      </w:r>
+    </w:p>
+    <w:p>
+      <w:pPr>
+        <w:pStyle w:val="berschrift3"/>
+      </w:pPr>
+      <w:r>
+        <w:t>components/GoalRow.jsx</w:t>
+      </w:r>
+    </w:p>
+    <w:p>
+      <w:r>
+        <w:t>Stellt ein Leistungsziel dar. Zeigt: Goal-ID (z.B. a1.1), Beschreibungstext, K-Buttons (0 bis max, farbig nach Bloom-Level), Max-Badge, Datum der letzten Speicherung, Kommentar-Textarea. Speichert bei Klick sofort (updateGoal), Kommentar wird nach 600ms debounced gespeichert.</w:t>
+      </w:r>
+    </w:p>
+    <w:p>
+      <w:pPr>
+        <w:pStyle w:val="berschrift3"/>
+      </w:pPr>
+      <w:r>
+        <w:t>components/DonutChart.jsx</w:t>
+      </w:r>
+    </w:p>
+    <w:p>
+      <w:r>
+        <w:t>Reine SVG-Darstellung (keine externe Library). Nimmt segments (Array mit value, color, label, sub) und centerPct. Zeichnet gefüllte Kreisringe via strokeDasharray auf mehreren überlagerten SVG-Circles.</w:t>
+      </w:r>
+    </w:p>
+    <w:p>
+      <w:pPr>
+        <w:pStyle w:val="berschrift3"/>
+      </w:pPr>
+      <w:r>
+        <w:t>pages/Overview.jsx</w:t>
+      </w:r>
+    </w:p>
+    <w:p>
+      <w:r>
+        <w:t>Hauptübersicht wenn ein User ausgewählt ist. Drei Sektionen: (1) Lehrzeit-Fortschritt: Balken pro Lehrjahr (grün=absolviert, blau-Gradient=aktuell, grau=zukünftig). (2) Bereichskacheln: Klickbare Karten mit Fortschrittsbalken in Bereichsfarbe. (3) Gesamtfortschritt: DonutChart links, Legende rechts (ein Eintrag pro Bereich + Noch nicht erreicht).</w:t>
+      </w:r>
+    </w:p>
+    <w:p>
+      <w:pPr>
+        <w:pStyle w:val="berschrift3"/>
+      </w:pPr>
+      <w:r>
+        <w:t>pages/AreaView.jsx</w:t>
+      </w:r>
+    </w:p>
+    <w:p>
+      <w:r>
+        <w:t>Detailansicht eines Handlungskompetenzbereichs. Zeigt Bereichsheader mit Fortschrittsbalken, Bloom-Legende K1–K6 (immer sichtbar), dann FHNW-Akkordeons pro Handlungskompetenz. Akkordeon-Header: grau geschlossen, #FFF48D (helles Gelb) geöffnet, + / × als dominantes Icon. Geöffnet: Tabelle mit GoalRows.</w:t>
+      </w:r>
+    </w:p>
+    <w:p>
+      <w:pPr>
+        <w:pStyle w:val="berschrift2"/>
+      </w:pPr>
+      <w:r>
+        <w:t>Gelernte React-Konzepte (Session 18)</w:t>
+      </w:r>
+    </w:p>
+    <w:p>
+      <w:r>
+        <w:t>• JSX – HTML-ähnliche Syntax direkt in JavaScript/TypeScript</w:t>
+      </w:r>
+    </w:p>
+    <w:p>
+      <w:r>
+        <w:t>• useState – Lokaler Komponentenstate (z.B. offene Akkordeons, Modal-Sichtbarkeit)</w:t>
+      </w:r>
+    </w:p>
+    <w:p>
+      <w:r>
+        <w:t>• useEffect – Seiteneffekte beim Laden (API-Calls in AppContext)</w:t>
+      </w:r>
+    </w:p>
+    <w:p>
+      <w:r>
+        <w:t>• useCallback – Memoized Callbacks (updateGoal, addUser etc.) für Performance</w:t>
+      </w:r>
+    </w:p>
+    <w:p>
+      <w:r>
+        <w:t>• useRef – Timer-Referenz für debounced Kommentar-Speicherung in GoalRow</w:t>
+      </w:r>
+    </w:p>
+    <w:p>
+      <w:r>
+        <w:t>• createContext / useContext – Globaler State ohne Prop-Drilling (useApp()-Hook)</w:t>
+      </w:r>
+    </w:p>
+    <w:p>
+      <w:r>
+        <w:t>• react-router-dom – Client-seitiges Routing: BrowserRouter, Routes, Route, Navigate, useNavigate, useParams, useLocation</w:t>
+      </w:r>
+    </w:p>
+    <w:p>
+      <w:r>
+        <w:t>• Vite – Moderner Build-Tool mit Hot Module Replacement (HMR)</w:t>
+      </w:r>
+    </w:p>
+    <w:p>
+      <w:pPr>
+        <w:pStyle w:val="berschrift2"/>
+      </w:pPr>
+      <w:r>
+        <w:t>Applikation starten</w:t>
+      </w:r>
+    </w:p>
+    <w:p>
+      <w:r>
+        <w:t>Backend (FastAPI, unverändert):</w:t>
+      </w:r>
+    </w:p>
+    <w:p>
+      <w:pPr>
+        <w:shd w:val="clear" w:color="auto" w:fill="E6E6E6"/>
+        <w:rPr>
+          <w:rFonts w:ascii="Courier New" w:hAnsi="Courier New" w:cs="Courier New"/>
+          <w:sz w:val="18"/>
+        </w:rPr>
+      </w:pPr>
+      <w:r>
+        <w:rPr>
+          <w:rFonts w:ascii="Courier New" w:hAnsi="Courier New" w:cs="Courier New"/>
+          <w:sz w:val="18"/>
+        </w:rPr>
+        <w:t>cd backend</w:t>
+      </w:r>
+    </w:p>
+    <w:p>
+      <w:pPr>
+        <w:shd w:val="clear" w:color="auto" w:fill="E6E6E6"/>
+        <w:rPr>
+          <w:rFonts w:ascii="Courier New" w:hAnsi="Courier New" w:cs="Courier New"/>
+          <w:sz w:val="18"/>
+        </w:rPr>
+      </w:pPr>
+      <w:r>
+        <w:rPr>
+          <w:rFonts w:ascii="Courier New" w:hAnsi="Courier New" w:cs="Courier New"/>
+          <w:sz w:val="18"/>
+        </w:rPr>
+        <w:t>uvicorn main:app --reload</w:t>
+      </w:r>
+    </w:p>
+    <w:p>
+      <w:r>
+        <w:t>React-Frontend (Vite Dev-Server):</w:t>
+      </w:r>
+    </w:p>
+    <w:p>
+      <w:pPr>
+        <w:shd w:val="clear" w:color="auto" w:fill="E6E6E6"/>
+        <w:rPr>
+          <w:rFonts w:ascii="Courier New" w:hAnsi="Courier New" w:cs="Courier New"/>
+          <w:sz w:val="18"/>
+        </w:rPr>
+      </w:pPr>
+      <w:r>
+        <w:rPr>
+          <w:rFonts w:ascii="Courier New" w:hAnsi="Courier New" w:cs="Courier New"/>
+          <w:sz w:val="18"/>
+        </w:rPr>
+        <w:t>cd frontend</w:t>
+      </w:r>
+    </w:p>
+    <w:p>
+      <w:pPr>
+        <w:shd w:val="clear" w:color="auto" w:fill="E6E6E6"/>
+        <w:rPr>
+          <w:rFonts w:ascii="Courier New" w:hAnsi="Courier New" w:cs="Courier New"/>
+          <w:sz w:val="18"/>
+        </w:rPr>
+      </w:pPr>
+      <w:r>
+        <w:rPr>
+          <w:rFonts w:ascii="Courier New" w:hAnsi="Courier New" w:cs="Courier New"/>
+          <w:sz w:val="18"/>
+        </w:rPr>
+        <w:t>npm run dev</w:t>
+      </w:r>
+    </w:p>
+    <w:p>
+      <w:pPr>
+        <w:shd w:val="clear" w:color="auto" w:fill="E6E6E6"/>
+        <w:rPr>
+          <w:rFonts w:ascii="Courier New" w:hAnsi="Courier New" w:cs="Courier New"/>
+          <w:sz w:val="18"/>
+        </w:rPr>
+      </w:pPr>
+    </w:p>
+    <w:p>
+      <w:pPr>
+        <w:shd w:val="clear" w:color="auto" w:fill="E6E6E6"/>
+        <w:rPr>
+          <w:rFonts w:ascii="Courier New" w:hAnsi="Courier New" w:cs="Courier New"/>
+          <w:sz w:val="18"/>
+        </w:rPr>
+      </w:pPr>
+      <w:r>
+        <w:rPr>
+          <w:rFonts w:ascii="Courier New" w:hAnsi="Courier New" w:cs="Courier New"/>
+          <w:sz w:val="18"/>
+        </w:rPr>
+        <w:t>Aufruf im Browser: http://localhost:5173</w:t>
+      </w:r>
+    </w:p>
+    <w:p>
+      <w:pPr>
+        <w:shd w:val="clear" w:color="auto" w:fill="E6E6E6"/>
+        <w:rPr>
+          <w:rFonts w:ascii="Courier New" w:hAnsi="Courier New" w:cs="Courier New"/>
+          <w:sz w:val="18"/>
+        </w:rPr>
+      </w:pPr>
+    </w:p>
     <w:sectPr>
       <w:headerReference w:type="first" r:id="rId14"/>
       <w:pgSz w:w="11906" w:h="16838" w:code="9"/>
@@ -5496,15 +6353,6 @@
 </file>
 
 <file path=customXml/item2.xml><?xml version="1.0" encoding="utf-8"?>
-<?mso-contentType ?>
-<FormTemplates xmlns="http://schemas.microsoft.com/sharepoint/v3/contenttype/forms">
-  <Display>DocumentLibraryForm</Display>
-  <Edit>DocumentLibraryForm</Edit>
-  <New>DocumentLibraryForm</New>
-</FormTemplates>
-</file>
-
-<file path=customXml/item3.xml><?xml version="1.0" encoding="utf-8"?>
 <ct:contentTypeSchema xmlns:ct="http://schemas.microsoft.com/office/2006/metadata/contentType" xmlns:ma="http://schemas.microsoft.com/office/2006/metadata/properties/metaAttributes" ct:_="" ma:_="" ma:contentTypeName="Dokument" ma:contentTypeID="0x0101007903E6EB9CF02E4A9D445768F33CE8A0" ma:contentTypeVersion="10" ma:contentTypeDescription="Ein neues Dokument erstellen." ma:contentTypeScope="" ma:versionID="6ae922be011154ab15be9f8e392bd017">
   <xsd:schema xmlns:xsd="http://www.w3.org/2001/XMLSchema" xmlns:xs="http://www.w3.org/2001/XMLSchema" xmlns:p="http://schemas.microsoft.com/office/2006/metadata/properties" xmlns:ns2="9c9658b7-70b6-4a85-98d8-6fbbaa45c305" xmlns:ns3="469fef08-e3b5-4743-af2d-0bc6e31c71c1" targetNamespace="http://schemas.microsoft.com/office/2006/metadata/properties" ma:root="true" ma:fieldsID="d06d8b5c4036d08665a49476e2e0a1f7" ns2:_="" ns3:_="">
     <xsd:import namespace="9c9658b7-70b6-4a85-98d8-6fbbaa45c305"/>
@@ -5709,14 +6557,23 @@
 </ct:contentTypeSchema>
 </file>
 
+<file path=customXml/item3.xml><?xml version="1.0" encoding="utf-8"?>
+<?mso-contentType ?>
+<FormTemplates xmlns="http://schemas.microsoft.com/sharepoint/v3/contenttype/forms">
+  <Display>DocumentLibraryForm</Display>
+  <Edit>DocumentLibraryForm</Edit>
+  <New>DocumentLibraryForm</New>
+</FormTemplates>
+</file>
+
 <file path=customXml/item4.xml><?xml version="1.0" encoding="utf-8"?>
-<b:Sources xmlns:b="http://schemas.openxmlformats.org/officeDocument/2006/bibliography" xmlns="http://schemas.openxmlformats.org/officeDocument/2006/bibliography" SelectedStyle="\APA.XSL" StyleName="APA"/>
+<p:properties xmlns:p="http://schemas.microsoft.com/office/2006/metadata/properties" xmlns:xsi="http://www.w3.org/2001/XMLSchema-instance" xmlns:pc="http://schemas.microsoft.com/office/infopath/2007/PartnerControls">
+  <documentManagement/>
+</p:properties>
 </file>
 
 <file path=customXml/item5.xml><?xml version="1.0" encoding="utf-8"?>
-<p:properties xmlns:p="http://schemas.microsoft.com/office/2006/metadata/properties" xmlns:xsi="http://www.w3.org/2001/XMLSchema-instance" xmlns:pc="http://schemas.microsoft.com/office/infopath/2007/PartnerControls">
-  <documentManagement/>
-</p:properties>
+<b:Sources xmlns:b="http://schemas.openxmlformats.org/officeDocument/2006/bibliography" xmlns="http://schemas.openxmlformats.org/officeDocument/2006/bibliography" SelectedStyle="\APA.XSL" StyleName="APA"/>
 </file>
 
 <file path=customXml/itemProps1.xml><?xml version="1.0" encoding="utf-8"?>
@@ -5728,14 +6585,6 @@
 </file>
 
 <file path=customXml/itemProps2.xml><?xml version="1.0" encoding="utf-8"?>
-<ds:datastoreItem xmlns:ds="http://schemas.openxmlformats.org/officeDocument/2006/customXml" ds:itemID="{D2CF7831-0288-43C5-9AFD-4D67A1E58A9C}">
-  <ds:schemaRefs>
-    <ds:schemaRef ds:uri="http://schemas.microsoft.com/sharepoint/v3/contenttype/forms"/>
-  </ds:schemaRefs>
-</ds:datastoreItem>
-</file>
-
-<file path=customXml/itemProps3.xml><?xml version="1.0" encoding="utf-8"?>
 <ds:datastoreItem xmlns:ds="http://schemas.openxmlformats.org/officeDocument/2006/customXml" ds:itemID="{6FA82E95-11C5-463A-AADD-8A833425D8D2}">
   <ds:schemaRefs>
     <ds:schemaRef ds:uri="http://schemas.microsoft.com/office/2006/metadata/contentType"/>
@@ -5754,19 +6603,27 @@
 </ds:datastoreItem>
 </file>
 
-<file path=customXml/itemProps4.xml><?xml version="1.0" encoding="utf-8"?>
-<ds:datastoreItem xmlns:ds="http://schemas.openxmlformats.org/officeDocument/2006/customXml" ds:itemID="{59CD317E-5156-4C3B-90E9-8DED7CA2EC5E}">
+<file path=customXml/itemProps3.xml><?xml version="1.0" encoding="utf-8"?>
+<ds:datastoreItem xmlns:ds="http://schemas.openxmlformats.org/officeDocument/2006/customXml" ds:itemID="{D2CF7831-0288-43C5-9AFD-4D67A1E58A9C}">
   <ds:schemaRefs>
-    <ds:schemaRef ds:uri="http://schemas.openxmlformats.org/officeDocument/2006/bibliography"/>
+    <ds:schemaRef ds:uri="http://schemas.microsoft.com/sharepoint/v3/contenttype/forms"/>
   </ds:schemaRefs>
 </ds:datastoreItem>
 </file>
 
-<file path=customXml/itemProps5.xml><?xml version="1.0" encoding="utf-8"?>
+<file path=customXml/itemProps4.xml><?xml version="1.0" encoding="utf-8"?>
 <ds:datastoreItem xmlns:ds="http://schemas.openxmlformats.org/officeDocument/2006/customXml" ds:itemID="{49D8654D-D35F-45A1-916C-E770D409409A}">
   <ds:schemaRefs>
     <ds:schemaRef ds:uri="http://schemas.microsoft.com/office/2006/metadata/properties"/>
     <ds:schemaRef ds:uri="http://schemas.microsoft.com/office/infopath/2007/PartnerControls"/>
   </ds:schemaRefs>
 </ds:datastoreItem>
+</file>
+
+<file path=customXml/itemProps5.xml><?xml version="1.0" encoding="utf-8"?>
+<ds:datastoreItem xmlns:ds="http://schemas.openxmlformats.org/officeDocument/2006/customXml" ds:itemID="{59CD317E-5156-4C3B-90E9-8DED7CA2EC5E}">
+  <ds:schemaRefs>
+    <ds:schemaRef ds:uri="http://schemas.openxmlformats.org/officeDocument/2006/bibliography"/>
+  </ds:schemaRefs>
+</ds:datastoreItem>
 </file>
</xml_diff>